<commit_message>
Added about error handling
</commit_message>
<xml_diff>
--- a/python.docx
+++ b/python.docx
@@ -21988,67 +21988,2198 @@
     <w:p>
       <w:pPr>
         <w:pStyle w:val="NoSpacing"/>
-      </w:pPr>
-    </w:p>
-    <w:p>
-      <w:pPr>
-        <w:pStyle w:val="NoSpacing"/>
-      </w:pPr>
-    </w:p>
-    <w:p>
-      <w:pPr>
-        <w:pStyle w:val="NoSpacing"/>
-      </w:pPr>
-    </w:p>
-    <w:p>
-      <w:pPr>
-        <w:pStyle w:val="NoSpacing"/>
-      </w:pPr>
-    </w:p>
-    <w:p>
-      <w:pPr>
-        <w:pStyle w:val="NoSpacing"/>
-      </w:pPr>
-    </w:p>
-    <w:p>
-      <w:pPr>
-        <w:pStyle w:val="NoSpacing"/>
-      </w:pPr>
-    </w:p>
-    <w:p>
-      <w:pPr>
-        <w:pStyle w:val="NoSpacing"/>
-      </w:pPr>
-    </w:p>
-    <w:p>
-      <w:pPr>
-        <w:pStyle w:val="NoSpacing"/>
-      </w:pPr>
-    </w:p>
-    <w:p>
-      <w:pPr>
-        <w:pStyle w:val="NoSpacing"/>
-      </w:pPr>
-    </w:p>
-    <w:p>
-      <w:pPr>
-        <w:pStyle w:val="NoSpacing"/>
-      </w:pPr>
-    </w:p>
-    <w:p>
-      <w:pPr>
-        <w:pStyle w:val="NoSpacing"/>
-      </w:pPr>
-    </w:p>
-    <w:p>
-      <w:pPr>
-        <w:pStyle w:val="NoSpacing"/>
-      </w:pPr>
-    </w:p>
-    <w:p>
-      <w:pPr>
-        <w:pStyle w:val="NoSpacing"/>
-      </w:pPr>
+        <w:rPr>
+          <w:b/>
+          <w:bCs/>
+          <w:sz w:val="44"/>
+          <w:szCs w:val="44"/>
+          <w:u w:val="single"/>
+        </w:rPr>
+      </w:pPr>
+      <w:r>
+        <w:rPr>
+          <w:b/>
+          <w:bCs/>
+          <w:sz w:val="44"/>
+          <w:szCs w:val="44"/>
+          <w:highlight w:val="magenta"/>
+          <w:u w:val="single"/>
+        </w:rPr>
+        <w:t>Debugging</w:t>
+      </w:r>
+    </w:p>
+    <w:p>
+      <w:pPr>
+        <w:pStyle w:val="NoSpacing"/>
+      </w:pPr>
+      <w:r>
+        <w:t>As you learn more advance concepts of Python, you will start making mistakes in your code. Sometimes these mistakes can be very hard to find.</w:t>
+      </w:r>
+    </w:p>
+    <w:p>
+      <w:pPr>
+        <w:pStyle w:val="NoSpacing"/>
+      </w:pPr>
+      <w:r>
+        <w:t>This is a good time to learn the basics of Debugging</w:t>
+      </w:r>
+    </w:p>
+    <w:p>
+      <w:pPr>
+        <w:pStyle w:val="NoSpacing"/>
+      </w:pPr>
+      <w:r>
+        <w:t># Debugging is finding and fixing errors in code.</w:t>
+      </w:r>
+    </w:p>
+    <w:p>
+      <w:pPr>
+        <w:pStyle w:val="NoSpacing"/>
+        <w:rPr>
+          <w:b/>
+          <w:bCs/>
+        </w:rPr>
+      </w:pPr>
+    </w:p>
+    <w:p>
+      <w:pPr>
+        <w:pStyle w:val="NoSpacing"/>
+        <w:rPr>
+          <w:b/>
+          <w:bCs/>
+        </w:rPr>
+      </w:pPr>
+    </w:p>
+    <w:p>
+      <w:pPr>
+        <w:pStyle w:val="NoSpacing"/>
+        <w:rPr>
+          <w:b/>
+          <w:bCs/>
+        </w:rPr>
+      </w:pPr>
+      <w:r>
+        <w:rPr>
+          <w:b/>
+          <w:bCs/>
+        </w:rPr>
+        <w:lastRenderedPageBreak/>
+        <w:t>What is a bug?</w:t>
+      </w:r>
+    </w:p>
+    <w:p>
+      <w:pPr>
+        <w:pStyle w:val="NoSpacing"/>
+      </w:pPr>
+      <w:r>
+        <w:t>A bug is an error that causes the program to generate an unexpected output that is different from the expected output or no output. What are some of the error codes you saw so far?</w:t>
+      </w:r>
+    </w:p>
+    <w:p>
+      <w:pPr>
+        <w:pStyle w:val="NoSpacing"/>
+        <w:numPr>
+          <w:ilvl w:val="0"/>
+          <w:numId w:val="42"/>
+        </w:numPr>
+        <w:rPr>
+          <w:highlight w:val="yellow"/>
+        </w:rPr>
+      </w:pPr>
+      <w:r>
+        <w:rPr>
+          <w:b/>
+          <w:bCs/>
+          <w:highlight w:val="yellow"/>
+        </w:rPr>
+        <w:t>CE</w:t>
+      </w:r>
+      <w:r>
+        <w:rPr>
+          <w:highlight w:val="yellow"/>
+        </w:rPr>
+        <w:t> - Compilation error / Syntax error</w:t>
+      </w:r>
+    </w:p>
+    <w:p>
+      <w:pPr>
+        <w:pStyle w:val="NoSpacing"/>
+        <w:numPr>
+          <w:ilvl w:val="0"/>
+          <w:numId w:val="42"/>
+        </w:numPr>
+        <w:rPr>
+          <w:highlight w:val="yellow"/>
+        </w:rPr>
+      </w:pPr>
+      <w:r>
+        <w:rPr>
+          <w:b/>
+          <w:bCs/>
+          <w:highlight w:val="yellow"/>
+        </w:rPr>
+        <w:t>RE</w:t>
+      </w:r>
+      <w:r>
+        <w:rPr>
+          <w:highlight w:val="yellow"/>
+        </w:rPr>
+        <w:t> - Run time error</w:t>
+      </w:r>
+    </w:p>
+    <w:p>
+      <w:pPr>
+        <w:pStyle w:val="NoSpacing"/>
+        <w:numPr>
+          <w:ilvl w:val="0"/>
+          <w:numId w:val="42"/>
+        </w:numPr>
+        <w:rPr>
+          <w:highlight w:val="yellow"/>
+        </w:rPr>
+      </w:pPr>
+      <w:r>
+        <w:rPr>
+          <w:b/>
+          <w:bCs/>
+          <w:highlight w:val="yellow"/>
+        </w:rPr>
+        <w:t>WA</w:t>
+      </w:r>
+      <w:r>
+        <w:rPr>
+          <w:highlight w:val="yellow"/>
+        </w:rPr>
+        <w:t> - Wrong answer / Logical error</w:t>
+      </w:r>
+    </w:p>
+    <w:p>
+      <w:pPr>
+        <w:pStyle w:val="NoSpacing"/>
+        <w:numPr>
+          <w:ilvl w:val="0"/>
+          <w:numId w:val="42"/>
+        </w:numPr>
+        <w:rPr>
+          <w:highlight w:val="yellow"/>
+        </w:rPr>
+      </w:pPr>
+      <w:r>
+        <w:rPr>
+          <w:b/>
+          <w:bCs/>
+          <w:highlight w:val="yellow"/>
+        </w:rPr>
+        <w:t>TLE</w:t>
+      </w:r>
+      <w:r>
+        <w:rPr>
+          <w:highlight w:val="yellow"/>
+        </w:rPr>
+        <w:t> - Time limit exceeded</w:t>
+      </w:r>
+    </w:p>
+    <w:p>
+      <w:pPr>
+        <w:pStyle w:val="NoSpacing"/>
+      </w:pPr>
+    </w:p>
+    <w:p>
+      <w:pPr>
+        <w:pStyle w:val="NoSpacing"/>
+        <w:rPr>
+          <w:b/>
+          <w:bCs/>
+          <w:sz w:val="44"/>
+          <w:szCs w:val="44"/>
+          <w:u w:val="single"/>
+        </w:rPr>
+      </w:pPr>
+      <w:r>
+        <w:rPr>
+          <w:b/>
+          <w:bCs/>
+          <w:sz w:val="44"/>
+          <w:szCs w:val="44"/>
+          <w:u w:val="single"/>
+        </w:rPr>
+        <w:t>Understanding Common Error Types - Compilation Errors</w:t>
+      </w:r>
+    </w:p>
+    <w:p>
+      <w:pPr>
+        <w:pStyle w:val="NoSpacing"/>
+      </w:pPr>
+      <w:r>
+        <w:t xml:space="preserve">When you write a program, the code you create needs to be translated into a format that the computer can understand. </w:t>
+      </w:r>
+      <w:r>
+        <w:rPr>
+          <w:highlight w:val="yellow"/>
+        </w:rPr>
+        <w:t>This process is called compilation,</w:t>
+      </w:r>
+      <w:r>
+        <w:t xml:space="preserve"> and it happens before your program runs. If there are any mistakes in your code that prevent it from being successfully compiled, you will see compilation errors.</w:t>
+      </w:r>
+    </w:p>
+    <w:p>
+      <w:pPr>
+        <w:pStyle w:val="NoSpacing"/>
+      </w:pPr>
+    </w:p>
+    <w:p>
+      <w:pPr>
+        <w:pStyle w:val="NoSpacing"/>
+      </w:pPr>
+      <w:r>
+        <w:rPr>
+          <w:b/>
+          <w:bCs/>
+        </w:rPr>
+        <w:t>Examples</w:t>
+      </w:r>
+    </w:p>
+    <w:p>
+      <w:pPr>
+        <w:pStyle w:val="NoSpacing"/>
+        <w:numPr>
+          <w:ilvl w:val="0"/>
+          <w:numId w:val="43"/>
+        </w:numPr>
+        <w:rPr>
+          <w:highlight w:val="green"/>
+        </w:rPr>
+      </w:pPr>
+      <w:r>
+        <w:rPr>
+          <w:b/>
+          <w:bCs/>
+          <w:highlight w:val="green"/>
+        </w:rPr>
+        <w:t>Misspelled Keywords</w:t>
+      </w:r>
+    </w:p>
+    <w:p>
+      <w:pPr>
+        <w:pStyle w:val="NoSpacing"/>
+      </w:pPr>
+      <w:proofErr w:type="spellStart"/>
+      <w:proofErr w:type="gramStart"/>
+      <w:r>
+        <w:t>pritn</w:t>
+      </w:r>
+      <w:proofErr w:type="spellEnd"/>
+      <w:r>
+        <w:t>(</w:t>
+      </w:r>
+      <w:proofErr w:type="gramEnd"/>
+      <w:r>
+        <w:t>"Hello, World!")  # Error: '</w:t>
+      </w:r>
+      <w:proofErr w:type="spellStart"/>
+      <w:r>
+        <w:t>pritn</w:t>
+      </w:r>
+      <w:proofErr w:type="spellEnd"/>
+      <w:r>
+        <w:t>' is not a recognized keyword</w:t>
+      </w:r>
+    </w:p>
+    <w:p>
+      <w:pPr>
+        <w:pStyle w:val="NoSpacing"/>
+        <w:numPr>
+          <w:ilvl w:val="0"/>
+          <w:numId w:val="44"/>
+        </w:numPr>
+        <w:rPr>
+          <w:highlight w:val="green"/>
+        </w:rPr>
+      </w:pPr>
+      <w:r>
+        <w:rPr>
+          <w:b/>
+          <w:bCs/>
+          <w:highlight w:val="green"/>
+        </w:rPr>
+        <w:t>Missing or Extra Punctuation</w:t>
+      </w:r>
+    </w:p>
+    <w:p>
+      <w:pPr>
+        <w:pStyle w:val="NoSpacing"/>
+      </w:pPr>
+      <w:proofErr w:type="gramStart"/>
+      <w:r>
+        <w:t>print(</w:t>
+      </w:r>
+      <w:proofErr w:type="gramEnd"/>
+      <w:r>
+        <w:t>"Hello, World!"  # Error: Missing closing parenthesis</w:t>
+      </w:r>
+    </w:p>
+    <w:p>
+      <w:pPr>
+        <w:pStyle w:val="NoSpacing"/>
+        <w:numPr>
+          <w:ilvl w:val="0"/>
+          <w:numId w:val="45"/>
+        </w:numPr>
+        <w:rPr>
+          <w:highlight w:val="green"/>
+        </w:rPr>
+      </w:pPr>
+      <w:r>
+        <w:rPr>
+          <w:b/>
+          <w:bCs/>
+          <w:highlight w:val="green"/>
+        </w:rPr>
+        <w:t>Improper Indentation</w:t>
+      </w:r>
+    </w:p>
+    <w:p>
+      <w:pPr>
+        <w:pStyle w:val="NoSpacing"/>
+      </w:pPr>
+      <w:r>
+        <w:t xml:space="preserve">while </w:t>
+      </w:r>
+      <w:proofErr w:type="spellStart"/>
+      <w:r>
+        <w:t>i</w:t>
+      </w:r>
+      <w:proofErr w:type="spellEnd"/>
+      <w:r>
+        <w:t xml:space="preserve"> &gt;= 0:</w:t>
+      </w:r>
+    </w:p>
+    <w:p>
+      <w:pPr>
+        <w:pStyle w:val="NoSpacing"/>
+      </w:pPr>
+      <w:r>
+        <w:t>print("Hello</w:t>
+      </w:r>
+      <w:proofErr w:type="gramStart"/>
+      <w:r>
+        <w:t>")  #</w:t>
+      </w:r>
+      <w:proofErr w:type="gramEnd"/>
+      <w:r>
+        <w:t xml:space="preserve"> Error: </w:t>
+      </w:r>
+      <w:proofErr w:type="spellStart"/>
+      <w:r>
+        <w:t>IndentationError</w:t>
+      </w:r>
+      <w:proofErr w:type="spellEnd"/>
+      <w:r>
+        <w:t>, expected an indented block</w:t>
+      </w:r>
+    </w:p>
+    <w:p>
+      <w:pPr>
+        <w:pStyle w:val="NoSpacing"/>
+      </w:pPr>
+    </w:p>
+    <w:p>
+      <w:pPr>
+        <w:pStyle w:val="NoSpacing"/>
+        <w:rPr>
+          <w:b/>
+          <w:bCs/>
+          <w:sz w:val="40"/>
+          <w:szCs w:val="40"/>
+          <w:u w:val="single"/>
+        </w:rPr>
+      </w:pPr>
+      <w:r>
+        <w:rPr>
+          <w:b/>
+          <w:bCs/>
+          <w:sz w:val="40"/>
+          <w:szCs w:val="40"/>
+          <w:highlight w:val="yellow"/>
+          <w:u w:val="single"/>
+        </w:rPr>
+        <w:t>Understanding Common Error Types - Run-time errors</w:t>
+      </w:r>
+    </w:p>
+    <w:p>
+      <w:pPr>
+        <w:pStyle w:val="NoSpacing"/>
+      </w:pPr>
+      <w:r>
+        <w:t>In this lesson, we will explore run-time errors, which are errors that occur while your program is running. Unlike syntax errors, which are detected when you first execute your code, run-time errors happen during the execution phase. This means your program starts running, but something goes wrong that prevents it from completing successfully.</w:t>
+      </w:r>
+    </w:p>
+    <w:p>
+      <w:pPr>
+        <w:pStyle w:val="NoSpacing"/>
+      </w:pPr>
+      <w:r>
+        <w:t xml:space="preserve">Run-time errors can occur for various reasons, often due to unexpected conditions. For example, if you are working with user input using the </w:t>
+      </w:r>
+      <w:proofErr w:type="gramStart"/>
+      <w:r>
+        <w:t>input(</w:t>
+      </w:r>
+      <w:proofErr w:type="gramEnd"/>
+      <w:r>
+        <w:t>) function and the user provides unexpected data, your program may crash. Similarly, performing operations on numbers, such as dividing by zero, will result in a run-time error.</w:t>
+      </w:r>
+    </w:p>
+    <w:p>
+      <w:pPr>
+        <w:pStyle w:val="NoSpacing"/>
+      </w:pPr>
+    </w:p>
+    <w:p>
+      <w:pPr>
+        <w:pStyle w:val="NoSpacing"/>
+      </w:pPr>
+      <w:r>
+        <w:rPr>
+          <w:b/>
+          <w:bCs/>
+        </w:rPr>
+        <w:t>Identifying Run-time Errors</w:t>
+      </w:r>
+    </w:p>
+    <w:p>
+      <w:pPr>
+        <w:pStyle w:val="NoSpacing"/>
+        <w:numPr>
+          <w:ilvl w:val="0"/>
+          <w:numId w:val="46"/>
+        </w:numPr>
+        <w:rPr>
+          <w:highlight w:val="green"/>
+        </w:rPr>
+      </w:pPr>
+      <w:r>
+        <w:rPr>
+          <w:b/>
+          <w:bCs/>
+          <w:highlight w:val="green"/>
+        </w:rPr>
+        <w:t>Output Operations</w:t>
+      </w:r>
+    </w:p>
+    <w:p>
+      <w:pPr>
+        <w:pStyle w:val="NoSpacing"/>
+      </w:pPr>
+      <w:r>
+        <w:t># Trying to print a variable that hasn't been defined</w:t>
+      </w:r>
+    </w:p>
+    <w:p>
+      <w:pPr>
+        <w:pStyle w:val="NoSpacing"/>
+      </w:pPr>
+      <w:r>
+        <w:t>print(</w:t>
+      </w:r>
+      <w:proofErr w:type="spellStart"/>
+      <w:r>
+        <w:t>undeclared_</w:t>
+      </w:r>
+      <w:proofErr w:type="gramStart"/>
+      <w:r>
+        <w:t>var</w:t>
+      </w:r>
+      <w:proofErr w:type="spellEnd"/>
+      <w:r>
+        <w:t>)  #</w:t>
+      </w:r>
+      <w:proofErr w:type="gramEnd"/>
+      <w:r>
+        <w:t xml:space="preserve"> This will cause a run-time error</w:t>
+      </w:r>
+    </w:p>
+    <w:p>
+      <w:pPr>
+        <w:pStyle w:val="NoSpacing"/>
+        <w:numPr>
+          <w:ilvl w:val="0"/>
+          <w:numId w:val="47"/>
+        </w:numPr>
+        <w:rPr>
+          <w:highlight w:val="green"/>
+        </w:rPr>
+      </w:pPr>
+      <w:r>
+        <w:rPr>
+          <w:b/>
+          <w:bCs/>
+          <w:highlight w:val="green"/>
+        </w:rPr>
+        <w:t>Integer and Float Operations</w:t>
+      </w:r>
+    </w:p>
+    <w:p>
+      <w:pPr>
+        <w:pStyle w:val="NoSpacing"/>
+      </w:pPr>
+      <w:r>
+        <w:t># Dividing by zero causes a run-time error</w:t>
+      </w:r>
+    </w:p>
+    <w:p>
+      <w:pPr>
+        <w:pStyle w:val="NoSpacing"/>
+      </w:pPr>
+      <w:r>
+        <w:t xml:space="preserve">result = 10 / </w:t>
+      </w:r>
+      <w:proofErr w:type="gramStart"/>
+      <w:r>
+        <w:t>0  #</w:t>
+      </w:r>
+      <w:proofErr w:type="gramEnd"/>
+      <w:r>
+        <w:t xml:space="preserve"> This will raise a </w:t>
+      </w:r>
+      <w:proofErr w:type="spellStart"/>
+      <w:r>
+        <w:t>ZeroDivisionError</w:t>
+      </w:r>
+      <w:proofErr w:type="spellEnd"/>
+    </w:p>
+    <w:p>
+      <w:pPr>
+        <w:pStyle w:val="NoSpacing"/>
+        <w:numPr>
+          <w:ilvl w:val="0"/>
+          <w:numId w:val="48"/>
+        </w:numPr>
+        <w:rPr>
+          <w:highlight w:val="green"/>
+        </w:rPr>
+      </w:pPr>
+      <w:r>
+        <w:rPr>
+          <w:b/>
+          <w:bCs/>
+          <w:highlight w:val="green"/>
+        </w:rPr>
+        <w:t>String Methods</w:t>
+      </w:r>
+    </w:p>
+    <w:p>
+      <w:pPr>
+        <w:pStyle w:val="NoSpacing"/>
+      </w:pPr>
+      <w:r>
+        <w:t># Accessing an out-of-range index in a string</w:t>
+      </w:r>
+    </w:p>
+    <w:p>
+      <w:pPr>
+        <w:pStyle w:val="NoSpacing"/>
+      </w:pPr>
+      <w:r>
+        <w:t>string = "hello"</w:t>
+      </w:r>
+    </w:p>
+    <w:p>
+      <w:pPr>
+        <w:pStyle w:val="NoSpacing"/>
+      </w:pPr>
+      <w:r>
+        <w:t xml:space="preserve">char = </w:t>
+      </w:r>
+      <w:proofErr w:type="gramStart"/>
+      <w:r>
+        <w:t>string[</w:t>
+      </w:r>
+      <w:proofErr w:type="gramEnd"/>
+      <w:r>
+        <w:t>10</w:t>
+      </w:r>
+      <w:proofErr w:type="gramStart"/>
+      <w:r>
+        <w:t>]  #</w:t>
+      </w:r>
+      <w:proofErr w:type="gramEnd"/>
+      <w:r>
+        <w:t xml:space="preserve"> This will cause an </w:t>
+      </w:r>
+      <w:proofErr w:type="spellStart"/>
+      <w:r>
+        <w:t>IndexError</w:t>
+      </w:r>
+      <w:proofErr w:type="spellEnd"/>
+    </w:p>
+    <w:p>
+      <w:pPr>
+        <w:pStyle w:val="NoSpacing"/>
+        <w:rPr>
+          <w:b/>
+          <w:bCs/>
+          <w:sz w:val="44"/>
+          <w:szCs w:val="44"/>
+          <w:u w:val="single"/>
+        </w:rPr>
+      </w:pPr>
+      <w:r>
+        <w:rPr>
+          <w:b/>
+          <w:bCs/>
+          <w:sz w:val="44"/>
+          <w:szCs w:val="44"/>
+          <w:highlight w:val="magenta"/>
+          <w:u w:val="single"/>
+        </w:rPr>
+        <w:lastRenderedPageBreak/>
+        <w:t>Basics of Try-Except in Python</w:t>
+      </w:r>
+    </w:p>
+    <w:p>
+      <w:pPr>
+        <w:pStyle w:val="NoSpacing"/>
+      </w:pPr>
+      <w:r>
+        <w:t>Till now, we have studied different types of errors that can occur in a program. Some errors are encountered during compilation, known as compile-time errors, which can be detected and fixed before running the code. However, some errors occur during execution, known as runtime errors, which can cause the program to crash unexpectedly.</w:t>
+      </w:r>
+    </w:p>
+    <w:p>
+      <w:pPr>
+        <w:pStyle w:val="NoSpacing"/>
+      </w:pPr>
+      <w:r>
+        <w:rPr>
+          <w:b/>
+          <w:bCs/>
+        </w:rPr>
+        <w:t>Example</w:t>
+      </w:r>
+    </w:p>
+    <w:p>
+      <w:pPr>
+        <w:pStyle w:val="NoSpacing"/>
+      </w:pPr>
+      <w:r>
+        <w:t>while true:</w:t>
+      </w:r>
+    </w:p>
+    <w:p>
+      <w:pPr>
+        <w:pStyle w:val="NoSpacing"/>
+      </w:pPr>
+      <w:r>
+        <w:t xml:space="preserve">   a=10</w:t>
+      </w:r>
+    </w:p>
+    <w:p>
+      <w:pPr>
+        <w:pStyle w:val="NoSpacing"/>
+      </w:pPr>
+      <w:r>
+        <w:t xml:space="preserve">   b=0</w:t>
+      </w:r>
+    </w:p>
+    <w:p>
+      <w:pPr>
+        <w:pStyle w:val="NoSpacing"/>
+      </w:pPr>
+      <w:r>
+        <w:t xml:space="preserve">   c=a/b # It will simply crash the code, resulting in a runtime error in the output.</w:t>
+      </w:r>
+    </w:p>
+    <w:p>
+      <w:pPr>
+        <w:pStyle w:val="NoSpacing"/>
+      </w:pPr>
+      <w:r>
+        <w:t xml:space="preserve">   </w:t>
+      </w:r>
+      <w:proofErr w:type="gramStart"/>
+      <w:r>
+        <w:t>print(</w:t>
+      </w:r>
+      <w:proofErr w:type="gramEnd"/>
+      <w:r>
+        <w:t>"invalid value of c")</w:t>
+      </w:r>
+    </w:p>
+    <w:p>
+      <w:pPr>
+        <w:pStyle w:val="NoSpacing"/>
+      </w:pPr>
+      <w:r>
+        <w:rPr>
+          <w:b/>
+          <w:bCs/>
+        </w:rPr>
+        <w:t>We don't want a runtime error while running our code, so we'll use the try-except concept, which will help our code not crash but keep running with a custom user error message.</w:t>
+      </w:r>
+    </w:p>
+    <w:p>
+      <w:pPr>
+        <w:pStyle w:val="NoSpacing"/>
+      </w:pPr>
+    </w:p>
+    <w:p>
+      <w:pPr>
+        <w:pStyle w:val="NoSpacing"/>
+      </w:pPr>
+      <w:r>
+        <w:t>The basic structure of a try-except block looks like this:</w:t>
+      </w:r>
+    </w:p>
+    <w:p>
+      <w:pPr>
+        <w:pStyle w:val="NoSpacing"/>
+        <w:rPr>
+          <w:highlight w:val="yellow"/>
+        </w:rPr>
+      </w:pPr>
+      <w:r>
+        <w:rPr>
+          <w:highlight w:val="yellow"/>
+        </w:rPr>
+        <w:t>try:</w:t>
+      </w:r>
+    </w:p>
+    <w:p>
+      <w:pPr>
+        <w:pStyle w:val="NoSpacing"/>
+        <w:rPr>
+          <w:highlight w:val="yellow"/>
+        </w:rPr>
+      </w:pPr>
+      <w:r>
+        <w:rPr>
+          <w:highlight w:val="yellow"/>
+        </w:rPr>
+        <w:t xml:space="preserve">    # Code that might raise an exception</w:t>
+      </w:r>
+    </w:p>
+    <w:p>
+      <w:pPr>
+        <w:pStyle w:val="NoSpacing"/>
+        <w:rPr>
+          <w:highlight w:val="yellow"/>
+        </w:rPr>
+      </w:pPr>
+      <w:r>
+        <w:rPr>
+          <w:highlight w:val="yellow"/>
+        </w:rPr>
+        <w:t>except:</w:t>
+      </w:r>
+    </w:p>
+    <w:p>
+      <w:pPr>
+        <w:pStyle w:val="NoSpacing"/>
+      </w:pPr>
+      <w:r>
+        <w:rPr>
+          <w:highlight w:val="yellow"/>
+        </w:rPr>
+        <w:t xml:space="preserve">    # Code to handle the exception</w:t>
+      </w:r>
+    </w:p>
+    <w:p>
+      <w:pPr>
+        <w:pStyle w:val="NoSpacing"/>
+      </w:pPr>
+      <w:r>
+        <w:rPr>
+          <w:b/>
+          <w:bCs/>
+        </w:rPr>
+        <w:t>Example</w:t>
+      </w:r>
+    </w:p>
+    <w:p>
+      <w:pPr>
+        <w:pStyle w:val="NoSpacing"/>
+      </w:pPr>
+      <w:proofErr w:type="spellStart"/>
+      <w:r>
+        <w:t>i</w:t>
+      </w:r>
+      <w:proofErr w:type="spellEnd"/>
+      <w:r>
+        <w:t xml:space="preserve"> = 0</w:t>
+      </w:r>
+    </w:p>
+    <w:p>
+      <w:pPr>
+        <w:pStyle w:val="NoSpacing"/>
+      </w:pPr>
+      <w:r>
+        <w:t xml:space="preserve">while </w:t>
+      </w:r>
+      <w:proofErr w:type="spellStart"/>
+      <w:r>
+        <w:t>i</w:t>
+      </w:r>
+      <w:proofErr w:type="spellEnd"/>
+      <w:r>
+        <w:t>&lt;3:</w:t>
+      </w:r>
+    </w:p>
+    <w:p>
+      <w:pPr>
+        <w:pStyle w:val="NoSpacing"/>
+      </w:pPr>
+      <w:r>
+        <w:t xml:space="preserve">    a = 10</w:t>
+      </w:r>
+    </w:p>
+    <w:p>
+      <w:pPr>
+        <w:pStyle w:val="NoSpacing"/>
+      </w:pPr>
+      <w:r>
+        <w:t xml:space="preserve">    b = 0</w:t>
+      </w:r>
+    </w:p>
+    <w:p>
+      <w:pPr>
+        <w:pStyle w:val="NoSpacing"/>
+      </w:pPr>
+      <w:r>
+        <w:t xml:space="preserve">    try:</w:t>
+      </w:r>
+    </w:p>
+    <w:p>
+      <w:pPr>
+        <w:pStyle w:val="NoSpacing"/>
+      </w:pPr>
+      <w:r>
+        <w:t xml:space="preserve">        c = a / </w:t>
+      </w:r>
+      <w:proofErr w:type="gramStart"/>
+      <w:r>
+        <w:t>b  #</w:t>
+      </w:r>
+      <w:proofErr w:type="gramEnd"/>
+      <w:r>
+        <w:t xml:space="preserve"> This will raise a </w:t>
+      </w:r>
+      <w:proofErr w:type="spellStart"/>
+      <w:r>
+        <w:t>ZeroDivisionError</w:t>
+      </w:r>
+      <w:proofErr w:type="spellEnd"/>
+    </w:p>
+    <w:p>
+      <w:pPr>
+        <w:pStyle w:val="NoSpacing"/>
+      </w:pPr>
+      <w:r>
+        <w:t xml:space="preserve">    except:</w:t>
+      </w:r>
+    </w:p>
+    <w:p>
+      <w:pPr>
+        <w:pStyle w:val="NoSpacing"/>
+      </w:pPr>
+      <w:r>
+        <w:t xml:space="preserve">        </w:t>
+      </w:r>
+      <w:proofErr w:type="gramStart"/>
+      <w:r>
+        <w:t>print(</w:t>
+      </w:r>
+      <w:proofErr w:type="gramEnd"/>
+      <w:r>
+        <w:t>"Error: invalid value of c")</w:t>
+      </w:r>
+    </w:p>
+    <w:p>
+      <w:pPr>
+        <w:pStyle w:val="NoSpacing"/>
+      </w:pPr>
+      <w:r>
+        <w:t xml:space="preserve">        c = </w:t>
+      </w:r>
+      <w:proofErr w:type="gramStart"/>
+      <w:r>
+        <w:t>None  #</w:t>
+      </w:r>
+      <w:proofErr w:type="gramEnd"/>
+      <w:r>
+        <w:t xml:space="preserve"> Assigning a default value to prevent a crash</w:t>
+      </w:r>
+    </w:p>
+    <w:p>
+      <w:pPr>
+        <w:pStyle w:val="NoSpacing"/>
+      </w:pPr>
+      <w:r>
+        <w:t xml:space="preserve">    </w:t>
+      </w:r>
+      <w:proofErr w:type="gramStart"/>
+      <w:r>
+        <w:t>print(</w:t>
+      </w:r>
+      <w:proofErr w:type="gramEnd"/>
+      <w:r>
+        <w:t>"This line will also be printed, as our program is not crashed")</w:t>
+      </w:r>
+    </w:p>
+    <w:p>
+      <w:pPr>
+        <w:pStyle w:val="NoSpacing"/>
+      </w:pPr>
+      <w:r>
+        <w:t xml:space="preserve">    </w:t>
+      </w:r>
+      <w:proofErr w:type="spellStart"/>
+      <w:r>
+        <w:t>i</w:t>
+      </w:r>
+      <w:proofErr w:type="spellEnd"/>
+      <w:r>
+        <w:t>=i+1</w:t>
+      </w:r>
+    </w:p>
+    <w:p>
+      <w:pPr>
+        <w:pStyle w:val="NoSpacing"/>
+      </w:pPr>
+    </w:p>
+    <w:p>
+      <w:pPr>
+        <w:pStyle w:val="NoSpacing"/>
+      </w:pPr>
+    </w:p>
+    <w:p>
+      <w:pPr>
+        <w:pStyle w:val="NoSpacing"/>
+        <w:rPr>
+          <w:b/>
+          <w:bCs/>
+          <w:sz w:val="40"/>
+          <w:szCs w:val="40"/>
+          <w:u w:val="single"/>
+        </w:rPr>
+      </w:pPr>
+      <w:r>
+        <w:rPr>
+          <w:b/>
+          <w:bCs/>
+          <w:sz w:val="40"/>
+          <w:szCs w:val="40"/>
+          <w:u w:val="single"/>
+        </w:rPr>
+        <w:t>Handling Multiple Exceptions in Python Try-Except Blocks</w:t>
+      </w:r>
+    </w:p>
+    <w:p>
+      <w:pPr>
+        <w:pStyle w:val="NoSpacing"/>
+      </w:pPr>
+      <w:r>
+        <w:t>Until now, we have handled exceptions that occur in our code. But do we know what kind of error occurred? If we don't, how can we handle it properly?</w:t>
+      </w:r>
+      <w:r>
+        <w:br/>
+        <w:t>Now, suppose our code has multiple runtime errors. Since try-except is used to handle runtime errors, how can we handle different types of errors separately?</w:t>
+      </w:r>
+    </w:p>
+    <w:p>
+      <w:pPr>
+        <w:pStyle w:val="NoSpacing"/>
+      </w:pPr>
+    </w:p>
+    <w:p>
+      <w:pPr>
+        <w:pStyle w:val="NoSpacing"/>
+      </w:pPr>
+      <w:r>
+        <w:rPr>
+          <w:b/>
+          <w:bCs/>
+        </w:rPr>
+        <w:t>Common runtime errors to handle:</w:t>
+      </w:r>
+    </w:p>
+    <w:p>
+      <w:pPr>
+        <w:pStyle w:val="NoSpacing"/>
+        <w:numPr>
+          <w:ilvl w:val="0"/>
+          <w:numId w:val="49"/>
+        </w:numPr>
+        <w:rPr>
+          <w:highlight w:val="yellow"/>
+        </w:rPr>
+      </w:pPr>
+      <w:proofErr w:type="spellStart"/>
+      <w:r>
+        <w:rPr>
+          <w:highlight w:val="yellow"/>
+        </w:rPr>
+        <w:t>ZeroDivisionError</w:t>
+      </w:r>
+      <w:proofErr w:type="spellEnd"/>
+    </w:p>
+    <w:p>
+      <w:pPr>
+        <w:pStyle w:val="NoSpacing"/>
+        <w:numPr>
+          <w:ilvl w:val="0"/>
+          <w:numId w:val="49"/>
+        </w:numPr>
+        <w:rPr>
+          <w:highlight w:val="yellow"/>
+        </w:rPr>
+      </w:pPr>
+      <w:proofErr w:type="spellStart"/>
+      <w:r>
+        <w:rPr>
+          <w:highlight w:val="yellow"/>
+        </w:rPr>
+        <w:t>ValueError</w:t>
+      </w:r>
+      <w:proofErr w:type="spellEnd"/>
+    </w:p>
+    <w:p>
+      <w:pPr>
+        <w:pStyle w:val="NoSpacing"/>
+        <w:numPr>
+          <w:ilvl w:val="0"/>
+          <w:numId w:val="49"/>
+        </w:numPr>
+        <w:rPr>
+          <w:highlight w:val="yellow"/>
+        </w:rPr>
+      </w:pPr>
+      <w:proofErr w:type="spellStart"/>
+      <w:r>
+        <w:rPr>
+          <w:highlight w:val="yellow"/>
+        </w:rPr>
+        <w:t>TypeError</w:t>
+      </w:r>
+      <w:proofErr w:type="spellEnd"/>
+    </w:p>
+    <w:p>
+      <w:pPr>
+        <w:pStyle w:val="NoSpacing"/>
+        <w:numPr>
+          <w:ilvl w:val="0"/>
+          <w:numId w:val="49"/>
+        </w:numPr>
+        <w:rPr>
+          <w:highlight w:val="yellow"/>
+        </w:rPr>
+      </w:pPr>
+      <w:proofErr w:type="spellStart"/>
+      <w:r>
+        <w:rPr>
+          <w:highlight w:val="yellow"/>
+        </w:rPr>
+        <w:lastRenderedPageBreak/>
+        <w:t>IndexError</w:t>
+      </w:r>
+      <w:proofErr w:type="spellEnd"/>
+    </w:p>
+    <w:p>
+      <w:pPr>
+        <w:pStyle w:val="NoSpacing"/>
+        <w:numPr>
+          <w:ilvl w:val="0"/>
+          <w:numId w:val="49"/>
+        </w:numPr>
+        <w:rPr>
+          <w:highlight w:val="yellow"/>
+        </w:rPr>
+      </w:pPr>
+      <w:proofErr w:type="spellStart"/>
+      <w:r>
+        <w:rPr>
+          <w:highlight w:val="yellow"/>
+        </w:rPr>
+        <w:t>KeyError</w:t>
+      </w:r>
+      <w:proofErr w:type="spellEnd"/>
+    </w:p>
+    <w:p>
+      <w:pPr>
+        <w:pStyle w:val="NoSpacing"/>
+        <w:numPr>
+          <w:ilvl w:val="0"/>
+          <w:numId w:val="49"/>
+        </w:numPr>
+        <w:rPr>
+          <w:highlight w:val="yellow"/>
+        </w:rPr>
+      </w:pPr>
+      <w:proofErr w:type="spellStart"/>
+      <w:r>
+        <w:rPr>
+          <w:highlight w:val="yellow"/>
+        </w:rPr>
+        <w:t>FileNotFoundError</w:t>
+      </w:r>
+      <w:proofErr w:type="spellEnd"/>
+    </w:p>
+    <w:p>
+      <w:pPr>
+        <w:pStyle w:val="NoSpacing"/>
+      </w:pPr>
+    </w:p>
+    <w:p>
+      <w:pPr>
+        <w:pStyle w:val="NoSpacing"/>
+      </w:pPr>
+      <w:r>
+        <w:t>Let's start with a basic example:</w:t>
+      </w:r>
+    </w:p>
+    <w:p>
+      <w:pPr>
+        <w:pStyle w:val="NoSpacing"/>
+      </w:pPr>
+      <w:r>
+        <w:t>try:</w:t>
+      </w:r>
+    </w:p>
+    <w:p>
+      <w:pPr>
+        <w:pStyle w:val="NoSpacing"/>
+      </w:pPr>
+      <w:r>
+        <w:t xml:space="preserve">    # Code that might raise exceptions</w:t>
+      </w:r>
+    </w:p>
+    <w:p>
+      <w:pPr>
+        <w:pStyle w:val="NoSpacing"/>
+      </w:pPr>
+      <w:r>
+        <w:t xml:space="preserve">    number = </w:t>
+      </w:r>
+      <w:proofErr w:type="gramStart"/>
+      <w:r>
+        <w:t>int(input(</w:t>
+      </w:r>
+      <w:proofErr w:type="gramEnd"/>
+      <w:r>
+        <w:t>"Enter a number: "))</w:t>
+      </w:r>
+    </w:p>
+    <w:p>
+      <w:pPr>
+        <w:pStyle w:val="NoSpacing"/>
+      </w:pPr>
+      <w:r>
+        <w:t xml:space="preserve">    result = 10 / number</w:t>
+      </w:r>
+    </w:p>
+    <w:p>
+      <w:pPr>
+        <w:pStyle w:val="NoSpacing"/>
+      </w:pPr>
+      <w:r>
+        <w:t xml:space="preserve">    print(result)</w:t>
+      </w:r>
+    </w:p>
+    <w:p>
+      <w:pPr>
+        <w:pStyle w:val="NoSpacing"/>
+      </w:pPr>
+      <w:r>
+        <w:t xml:space="preserve">except </w:t>
+      </w:r>
+      <w:proofErr w:type="spellStart"/>
+      <w:r>
+        <w:t>ValueError</w:t>
+      </w:r>
+      <w:proofErr w:type="spellEnd"/>
+      <w:r>
+        <w:t>:</w:t>
+      </w:r>
+    </w:p>
+    <w:p>
+      <w:pPr>
+        <w:pStyle w:val="NoSpacing"/>
+      </w:pPr>
+      <w:r>
+        <w:t xml:space="preserve">    </w:t>
+      </w:r>
+      <w:proofErr w:type="gramStart"/>
+      <w:r>
+        <w:t>print(</w:t>
+      </w:r>
+      <w:proofErr w:type="gramEnd"/>
+      <w:r>
+        <w:t>"I GOT VALUE ERROR!!!... ENTER A VALID INTEGER")</w:t>
+      </w:r>
+    </w:p>
+    <w:p>
+      <w:pPr>
+        <w:pStyle w:val="NoSpacing"/>
+      </w:pPr>
+      <w:r>
+        <w:t xml:space="preserve">except </w:t>
+      </w:r>
+      <w:proofErr w:type="spellStart"/>
+      <w:r>
+        <w:t>ZeroDivisionError</w:t>
+      </w:r>
+      <w:proofErr w:type="spellEnd"/>
+      <w:r>
+        <w:t>:</w:t>
+      </w:r>
+    </w:p>
+    <w:p>
+      <w:pPr>
+        <w:pStyle w:val="NoSpacing"/>
+      </w:pPr>
+      <w:r>
+        <w:t xml:space="preserve">    </w:t>
+      </w:r>
+      <w:proofErr w:type="gramStart"/>
+      <w:r>
+        <w:t>print(</w:t>
+      </w:r>
+      <w:proofErr w:type="gramEnd"/>
+      <w:r>
+        <w:t>"YOU DIVIDED SOME VALUE BY O??")</w:t>
+      </w:r>
+    </w:p>
+    <w:p>
+      <w:pPr>
+        <w:pStyle w:val="NoSpacing"/>
+      </w:pPr>
+      <w:r>
+        <w:t>In this example, we have two possible exceptions:</w:t>
+      </w:r>
+    </w:p>
+    <w:p>
+      <w:pPr>
+        <w:pStyle w:val="NoSpacing"/>
+        <w:numPr>
+          <w:ilvl w:val="0"/>
+          <w:numId w:val="50"/>
+        </w:numPr>
+      </w:pPr>
+      <w:proofErr w:type="spellStart"/>
+      <w:r>
+        <w:t>ValueError</w:t>
+      </w:r>
+      <w:proofErr w:type="spellEnd"/>
+      <w:r>
+        <w:t>: If the user enters a non-numeric value</w:t>
+      </w:r>
+    </w:p>
+    <w:p>
+      <w:pPr>
+        <w:pStyle w:val="NoSpacing"/>
+        <w:numPr>
+          <w:ilvl w:val="0"/>
+          <w:numId w:val="50"/>
+        </w:numPr>
+      </w:pPr>
+      <w:proofErr w:type="spellStart"/>
+      <w:r>
+        <w:t>ZeroDivisionError</w:t>
+      </w:r>
+      <w:proofErr w:type="spellEnd"/>
+      <w:r>
+        <w:t>: If the user enters zero</w:t>
+      </w:r>
+    </w:p>
+    <w:p>
+      <w:pPr>
+        <w:pStyle w:val="NoSpacing"/>
+      </w:pPr>
+      <w:r>
+        <w:t>We can handle these exceptions separately by using multiple except blocks. Each except block is responsible for handling a specific type of exception.</w:t>
+      </w:r>
+    </w:p>
+    <w:p>
+      <w:pPr>
+        <w:pStyle w:val="NoSpacing"/>
+      </w:pPr>
+    </w:p>
+    <w:p>
+      <w:pPr>
+        <w:pStyle w:val="NoSpacing"/>
+      </w:pPr>
+    </w:p>
+    <w:p>
+      <w:pPr>
+        <w:pStyle w:val="NoSpacing"/>
+        <w:rPr>
+          <w:b/>
+          <w:bCs/>
+          <w:sz w:val="44"/>
+          <w:szCs w:val="44"/>
+          <w:u w:val="single"/>
+        </w:rPr>
+      </w:pPr>
+      <w:r>
+        <w:rPr>
+          <w:b/>
+          <w:bCs/>
+          <w:sz w:val="44"/>
+          <w:szCs w:val="44"/>
+          <w:u w:val="single"/>
+        </w:rPr>
+        <w:t>The else Block in Try-Except</w:t>
+      </w:r>
+    </w:p>
+    <w:p>
+      <w:pPr>
+        <w:pStyle w:val="NoSpacing"/>
+      </w:pPr>
+      <w:r>
+        <w:t>In Python's try-except structure, we have an additional feature called the 'else' block. This block is executed when no exceptions occur in the try block. It's a way to specify code that should run only if the try block executes successfully.</w:t>
+      </w:r>
+    </w:p>
+    <w:p>
+      <w:pPr>
+        <w:pStyle w:val="NoSpacing"/>
+      </w:pPr>
+      <w:r>
+        <w:rPr>
+          <w:b/>
+          <w:bCs/>
+        </w:rPr>
+        <w:t>It simply improves code readability and separates normal execution from exception handling.</w:t>
+      </w:r>
+    </w:p>
+    <w:p>
+      <w:pPr>
+        <w:pStyle w:val="NoSpacing"/>
+      </w:pPr>
+    </w:p>
+    <w:p>
+      <w:pPr>
+        <w:pStyle w:val="NoSpacing"/>
+      </w:pPr>
+      <w:r>
+        <w:t>The basic structure looks like this:</w:t>
+      </w:r>
+    </w:p>
+    <w:p>
+      <w:pPr>
+        <w:pStyle w:val="NoSpacing"/>
+        <w:rPr>
+          <w:highlight w:val="yellow"/>
+        </w:rPr>
+      </w:pPr>
+      <w:r>
+        <w:rPr>
+          <w:highlight w:val="yellow"/>
+        </w:rPr>
+        <w:t>try:</w:t>
+      </w:r>
+    </w:p>
+    <w:p>
+      <w:pPr>
+        <w:pStyle w:val="NoSpacing"/>
+        <w:rPr>
+          <w:highlight w:val="yellow"/>
+        </w:rPr>
+      </w:pPr>
+      <w:r>
+        <w:rPr>
+          <w:highlight w:val="yellow"/>
+        </w:rPr>
+        <w:t xml:space="preserve">    # Code that might raise an exception</w:t>
+      </w:r>
+    </w:p>
+    <w:p>
+      <w:pPr>
+        <w:pStyle w:val="NoSpacing"/>
+        <w:rPr>
+          <w:highlight w:val="yellow"/>
+        </w:rPr>
+      </w:pPr>
+      <w:r>
+        <w:rPr>
+          <w:highlight w:val="yellow"/>
+        </w:rPr>
+        <w:t xml:space="preserve">except </w:t>
+      </w:r>
+      <w:proofErr w:type="spellStart"/>
+      <w:r>
+        <w:rPr>
+          <w:highlight w:val="yellow"/>
+        </w:rPr>
+        <w:t>ExceptionType</w:t>
+      </w:r>
+      <w:proofErr w:type="spellEnd"/>
+      <w:r>
+        <w:rPr>
+          <w:highlight w:val="yellow"/>
+        </w:rPr>
+        <w:t>:</w:t>
+      </w:r>
+    </w:p>
+    <w:p>
+      <w:pPr>
+        <w:pStyle w:val="NoSpacing"/>
+        <w:rPr>
+          <w:highlight w:val="yellow"/>
+        </w:rPr>
+      </w:pPr>
+      <w:r>
+        <w:rPr>
+          <w:highlight w:val="yellow"/>
+        </w:rPr>
+        <w:t xml:space="preserve">    # Handle the exception</w:t>
+      </w:r>
+    </w:p>
+    <w:p>
+      <w:pPr>
+        <w:pStyle w:val="NoSpacing"/>
+        <w:rPr>
+          <w:highlight w:val="yellow"/>
+        </w:rPr>
+      </w:pPr>
+      <w:r>
+        <w:rPr>
+          <w:highlight w:val="yellow"/>
+        </w:rPr>
+        <w:t>else:</w:t>
+      </w:r>
+    </w:p>
+    <w:p>
+      <w:pPr>
+        <w:pStyle w:val="NoSpacing"/>
+      </w:pPr>
+      <w:r>
+        <w:rPr>
+          <w:highlight w:val="yellow"/>
+        </w:rPr>
+        <w:t xml:space="preserve">    # Code to run if no exception occurred</w:t>
+      </w:r>
+    </w:p>
+    <w:p>
+      <w:pPr>
+        <w:pStyle w:val="NoSpacing"/>
+      </w:pPr>
+      <w:r>
+        <w:t>Let's look at a simple example using concepts we've learned before:</w:t>
+      </w:r>
+    </w:p>
+    <w:p>
+      <w:pPr>
+        <w:pStyle w:val="NoSpacing"/>
+      </w:pPr>
+      <w:r>
+        <w:t>try:</w:t>
+      </w:r>
+    </w:p>
+    <w:p>
+      <w:pPr>
+        <w:pStyle w:val="NoSpacing"/>
+      </w:pPr>
+      <w:r>
+        <w:t xml:space="preserve">    number = </w:t>
+      </w:r>
+      <w:proofErr w:type="gramStart"/>
+      <w:r>
+        <w:t>int(input(</w:t>
+      </w:r>
+      <w:proofErr w:type="gramEnd"/>
+      <w:r>
+        <w:t>"Enter a number: "))</w:t>
+      </w:r>
+    </w:p>
+    <w:p>
+      <w:pPr>
+        <w:pStyle w:val="NoSpacing"/>
+      </w:pPr>
+      <w:r>
+        <w:t xml:space="preserve">    result = 10 / number</w:t>
+      </w:r>
+    </w:p>
+    <w:p>
+      <w:pPr>
+        <w:pStyle w:val="NoSpacing"/>
+      </w:pPr>
+      <w:r>
+        <w:t xml:space="preserve">except </w:t>
+      </w:r>
+      <w:proofErr w:type="spellStart"/>
+      <w:r>
+        <w:t>ZeroDivisionError</w:t>
+      </w:r>
+      <w:proofErr w:type="spellEnd"/>
+      <w:r>
+        <w:t>:</w:t>
+      </w:r>
+    </w:p>
+    <w:p>
+      <w:pPr>
+        <w:pStyle w:val="NoSpacing"/>
+      </w:pPr>
+      <w:r>
+        <w:t xml:space="preserve">    </w:t>
+      </w:r>
+      <w:proofErr w:type="gramStart"/>
+      <w:r>
+        <w:t>print(</w:t>
+      </w:r>
+      <w:proofErr w:type="gramEnd"/>
+      <w:r>
+        <w:t>"Error: Cannot divide by zero!")</w:t>
+      </w:r>
+    </w:p>
+    <w:p>
+      <w:pPr>
+        <w:pStyle w:val="NoSpacing"/>
+      </w:pPr>
+      <w:r>
+        <w:t>else:</w:t>
+      </w:r>
+    </w:p>
+    <w:p>
+      <w:pPr>
+        <w:pStyle w:val="NoSpacing"/>
+      </w:pPr>
+      <w:r>
+        <w:t xml:space="preserve">    </w:t>
+      </w:r>
+      <w:proofErr w:type="gramStart"/>
+      <w:r>
+        <w:t>print(</w:t>
+      </w:r>
+      <w:proofErr w:type="spellStart"/>
+      <w:proofErr w:type="gramEnd"/>
+      <w:r>
+        <w:t>f"The</w:t>
+      </w:r>
+      <w:proofErr w:type="spellEnd"/>
+      <w:r>
+        <w:t xml:space="preserve"> result is: {result}") # prints the result if no exception encountered</w:t>
+      </w:r>
+    </w:p>
+    <w:p>
+      <w:pPr>
+        <w:pStyle w:val="NoSpacing"/>
+      </w:pPr>
+    </w:p>
+    <w:p>
+      <w:pPr>
+        <w:pStyle w:val="NoSpacing"/>
+      </w:pPr>
+    </w:p>
+    <w:p>
+      <w:pPr>
+        <w:pStyle w:val="NoSpacing"/>
+      </w:pPr>
+    </w:p>
+    <w:p>
+      <w:pPr>
+        <w:pStyle w:val="NoSpacing"/>
+        <w:rPr>
+          <w:b/>
+          <w:bCs/>
+          <w:sz w:val="44"/>
+          <w:szCs w:val="44"/>
+          <w:u w:val="single"/>
+        </w:rPr>
+      </w:pPr>
+      <w:r>
+        <w:rPr>
+          <w:b/>
+          <w:bCs/>
+          <w:sz w:val="44"/>
+          <w:szCs w:val="44"/>
+          <w:u w:val="single"/>
+        </w:rPr>
+        <w:lastRenderedPageBreak/>
+        <w:t>The Finally Block in Try-Except</w:t>
+      </w:r>
+    </w:p>
+    <w:p>
+      <w:pPr>
+        <w:pStyle w:val="NoSpacing"/>
+      </w:pPr>
+      <w:r>
+        <w:t>We have studied the else block, and just like the else block, we also have the finally block, which contains a piece of code that will be executed regardless of whether an error occurs or not.</w:t>
+      </w:r>
+    </w:p>
+    <w:p>
+      <w:pPr>
+        <w:pStyle w:val="NoSpacing"/>
+      </w:pPr>
+      <w:r>
+        <w:t>But now the question is: why use the finally block when we can directly write that piece of code after the try-except block, as shown below?</w:t>
+      </w:r>
+    </w:p>
+    <w:p>
+      <w:pPr>
+        <w:pStyle w:val="NoSpacing"/>
+      </w:pPr>
+      <w:r>
+        <w:t>try:</w:t>
+      </w:r>
+    </w:p>
+    <w:p>
+      <w:pPr>
+        <w:pStyle w:val="NoSpacing"/>
+      </w:pPr>
+      <w:r>
+        <w:t xml:space="preserve">   c=10/0</w:t>
+      </w:r>
+    </w:p>
+    <w:p>
+      <w:pPr>
+        <w:pStyle w:val="NoSpacing"/>
+      </w:pPr>
+      <w:r>
+        <w:t>except:</w:t>
+      </w:r>
+    </w:p>
+    <w:p>
+      <w:pPr>
+        <w:pStyle w:val="NoSpacing"/>
+      </w:pPr>
+      <w:r>
+        <w:t xml:space="preserve">   print("Error")</w:t>
+      </w:r>
+    </w:p>
+    <w:p>
+      <w:pPr>
+        <w:pStyle w:val="NoSpacing"/>
+      </w:pPr>
+      <w:proofErr w:type="gramStart"/>
+      <w:r>
+        <w:t>print(</w:t>
+      </w:r>
+      <w:proofErr w:type="gramEnd"/>
+      <w:r>
+        <w:t>"Piece of code of finally")</w:t>
+      </w:r>
+    </w:p>
+    <w:p>
+      <w:pPr>
+        <w:pStyle w:val="NoSpacing"/>
+      </w:pPr>
+    </w:p>
+    <w:p>
+      <w:pPr>
+        <w:pStyle w:val="NoSpacing"/>
+      </w:pPr>
+      <w:r>
+        <w:t>The main reason for using the finally block instead of writing the cleanup code directly after the try-except block is </w:t>
+      </w:r>
+      <w:r>
+        <w:rPr>
+          <w:b/>
+          <w:bCs/>
+        </w:rPr>
+        <w:t>guaranteed execution</w:t>
+      </w:r>
+      <w:r>
+        <w:t>, even in cases where the program flow is interrupted.</w:t>
+      </w:r>
+    </w:p>
+    <w:p>
+      <w:pPr>
+        <w:pStyle w:val="NoSpacing"/>
+        <w:rPr>
+          <w:highlight w:val="yellow"/>
+        </w:rPr>
+      </w:pPr>
+      <w:r>
+        <w:rPr>
+          <w:highlight w:val="yellow"/>
+        </w:rPr>
+        <w:t>try:</w:t>
+      </w:r>
+    </w:p>
+    <w:p>
+      <w:pPr>
+        <w:pStyle w:val="NoSpacing"/>
+        <w:rPr>
+          <w:highlight w:val="yellow"/>
+        </w:rPr>
+      </w:pPr>
+      <w:r>
+        <w:rPr>
+          <w:highlight w:val="yellow"/>
+        </w:rPr>
+        <w:t xml:space="preserve">   c=10/0</w:t>
+      </w:r>
+    </w:p>
+    <w:p>
+      <w:pPr>
+        <w:pStyle w:val="NoSpacing"/>
+        <w:rPr>
+          <w:highlight w:val="yellow"/>
+        </w:rPr>
+      </w:pPr>
+      <w:r>
+        <w:rPr>
+          <w:highlight w:val="yellow"/>
+        </w:rPr>
+        <w:t>except:</w:t>
+      </w:r>
+    </w:p>
+    <w:p>
+      <w:pPr>
+        <w:pStyle w:val="NoSpacing"/>
+        <w:rPr>
+          <w:highlight w:val="yellow"/>
+        </w:rPr>
+      </w:pPr>
+      <w:r>
+        <w:rPr>
+          <w:highlight w:val="yellow"/>
+        </w:rPr>
+        <w:t xml:space="preserve">   print("Error")</w:t>
+      </w:r>
+    </w:p>
+    <w:p>
+      <w:pPr>
+        <w:pStyle w:val="NoSpacing"/>
+        <w:rPr>
+          <w:highlight w:val="yellow"/>
+        </w:rPr>
+      </w:pPr>
+      <w:r>
+        <w:rPr>
+          <w:highlight w:val="yellow"/>
+        </w:rPr>
+        <w:t>finally:</w:t>
+      </w:r>
+    </w:p>
+    <w:p>
+      <w:pPr>
+        <w:pStyle w:val="NoSpacing"/>
+      </w:pPr>
+      <w:r>
+        <w:rPr>
+          <w:highlight w:val="yellow"/>
+        </w:rPr>
+        <w:t xml:space="preserve">   </w:t>
+      </w:r>
+      <w:proofErr w:type="gramStart"/>
+      <w:r>
+        <w:rPr>
+          <w:highlight w:val="yellow"/>
+        </w:rPr>
+        <w:t>print(</w:t>
+      </w:r>
+      <w:proofErr w:type="gramEnd"/>
+      <w:r>
+        <w:rPr>
+          <w:highlight w:val="yellow"/>
+        </w:rPr>
+        <w:t>"Piece of code of finally")</w:t>
+      </w:r>
+    </w:p>
+    <w:p>
+      <w:pPr>
+        <w:pStyle w:val="NoSpacing"/>
+      </w:pPr>
+    </w:p>
+    <w:p>
+      <w:pPr>
+        <w:pStyle w:val="NoSpacing"/>
+      </w:pPr>
+    </w:p>
+    <w:p>
+      <w:pPr>
+        <w:pStyle w:val="NoSpacing"/>
+        <w:rPr>
+          <w:b/>
+          <w:bCs/>
+          <w:sz w:val="44"/>
+          <w:szCs w:val="44"/>
+          <w:u w:val="single"/>
+        </w:rPr>
+      </w:pPr>
+      <w:r>
+        <w:rPr>
+          <w:b/>
+          <w:bCs/>
+          <w:sz w:val="44"/>
+          <w:szCs w:val="44"/>
+          <w:u w:val="single"/>
+        </w:rPr>
+        <w:t>Function Structure (def keyword)</w:t>
+      </w:r>
+    </w:p>
+    <w:p>
+      <w:pPr>
+        <w:pStyle w:val="NoSpacing"/>
+      </w:pPr>
+      <w:r>
+        <w:t>Functions in Python allow for efficient code structuring and reuse. A function is defined using the def keyword, and when called, control jumps to the function definition, executes its body, and then returns to the next line after the call. Functions are essential in Python, enabling modular programming and reusable code structures.</w:t>
+      </w:r>
+    </w:p>
+    <w:p>
+      <w:pPr>
+        <w:pStyle w:val="NoSpacing"/>
+      </w:pPr>
+    </w:p>
+    <w:p>
+      <w:pPr>
+        <w:pStyle w:val="NoSpacing"/>
+      </w:pPr>
+      <w:r>
+        <w:rPr>
+          <w:b/>
+          <w:bCs/>
+        </w:rPr>
+        <w:t>Defining a Function</w:t>
+      </w:r>
+    </w:p>
+    <w:p>
+      <w:pPr>
+        <w:pStyle w:val="NoSpacing"/>
+      </w:pPr>
+      <w:r>
+        <w:t>When defining a function, indentation is crucial, as it determines which statements belong to the function body.</w:t>
+      </w:r>
+    </w:p>
+    <w:p>
+      <w:pPr>
+        <w:pStyle w:val="NoSpacing"/>
+        <w:rPr>
+          <w:highlight w:val="yellow"/>
+        </w:rPr>
+      </w:pPr>
+      <w:r>
+        <w:rPr>
+          <w:highlight w:val="yellow"/>
+        </w:rPr>
+        <w:t xml:space="preserve">def </w:t>
+      </w:r>
+      <w:proofErr w:type="spellStart"/>
+      <w:r>
+        <w:rPr>
+          <w:highlight w:val="yellow"/>
+        </w:rPr>
+        <w:t>my_</w:t>
+      </w:r>
+      <w:proofErr w:type="gramStart"/>
+      <w:r>
+        <w:rPr>
+          <w:highlight w:val="yellow"/>
+        </w:rPr>
+        <w:t>function</w:t>
+      </w:r>
+      <w:proofErr w:type="spellEnd"/>
+      <w:r>
+        <w:rPr>
+          <w:highlight w:val="yellow"/>
+        </w:rPr>
+        <w:t>(</w:t>
+      </w:r>
+      <w:proofErr w:type="gramEnd"/>
+      <w:r>
+        <w:rPr>
+          <w:highlight w:val="yellow"/>
+        </w:rPr>
+        <w:t>):</w:t>
+      </w:r>
+    </w:p>
+    <w:p>
+      <w:pPr>
+        <w:pStyle w:val="NoSpacing"/>
+      </w:pPr>
+      <w:r>
+        <w:rPr>
+          <w:highlight w:val="yellow"/>
+        </w:rPr>
+        <w:t xml:space="preserve">    </w:t>
+      </w:r>
+      <w:proofErr w:type="gramStart"/>
+      <w:r>
+        <w:rPr>
+          <w:highlight w:val="yellow"/>
+        </w:rPr>
+        <w:t>print(</w:t>
+      </w:r>
+      <w:proofErr w:type="gramEnd"/>
+      <w:r>
+        <w:rPr>
+          <w:highlight w:val="yellow"/>
+        </w:rPr>
+        <w:t>"Hello from a function</w:t>
+      </w:r>
+      <w:proofErr w:type="gramStart"/>
+      <w:r>
+        <w:rPr>
+          <w:highlight w:val="yellow"/>
+        </w:rPr>
+        <w:t>")  #</w:t>
+      </w:r>
+      <w:proofErr w:type="gramEnd"/>
+      <w:r>
+        <w:rPr>
+          <w:highlight w:val="yellow"/>
+        </w:rPr>
+        <w:t xml:space="preserve"> Function body</w:t>
+      </w:r>
+    </w:p>
+    <w:p>
+      <w:pPr>
+        <w:pStyle w:val="NoSpacing"/>
+      </w:pPr>
+      <w:r>
+        <w:t># `def` Keyword: Used to define a function in Python.</w:t>
+      </w:r>
+    </w:p>
+    <w:p>
+      <w:pPr>
+        <w:pStyle w:val="NoSpacing"/>
+      </w:pPr>
+      <w:r>
+        <w:t># Function Name (</w:t>
+      </w:r>
+      <w:proofErr w:type="spellStart"/>
+      <w:r>
+        <w:t>my_function</w:t>
+      </w:r>
+      <w:proofErr w:type="spellEnd"/>
+      <w:r>
+        <w:t>): The name assigned to the function. It should be meaningful.</w:t>
+      </w:r>
+    </w:p>
+    <w:p>
+      <w:pPr>
+        <w:pStyle w:val="NoSpacing"/>
+      </w:pPr>
+      <w:r>
+        <w:t># Function Body:  Contains statements indented under the function, which execute when the function is called.</w:t>
+      </w:r>
+    </w:p>
+    <w:p>
+      <w:pPr>
+        <w:pStyle w:val="NoSpacing"/>
+      </w:pPr>
+      <w:r>
+        <w:rPr>
+          <w:b/>
+          <w:bCs/>
+        </w:rPr>
+        <w:t>Calling a Function</w:t>
+      </w:r>
+    </w:p>
+    <w:p>
+      <w:pPr>
+        <w:pStyle w:val="NoSpacing"/>
+      </w:pPr>
+      <w:proofErr w:type="spellStart"/>
+      <w:r>
+        <w:t>my_</w:t>
+      </w:r>
+      <w:proofErr w:type="gramStart"/>
+      <w:r>
+        <w:t>function</w:t>
+      </w:r>
+      <w:proofErr w:type="spellEnd"/>
+      <w:r>
+        <w:t>()  #</w:t>
+      </w:r>
+      <w:proofErr w:type="gramEnd"/>
+      <w:r>
+        <w:t xml:space="preserve"> Outputs: Hello from a function</w:t>
+      </w:r>
+    </w:p>
+    <w:p>
+      <w:pPr>
+        <w:pStyle w:val="NoSpacing"/>
+      </w:pPr>
+      <w:r>
+        <w:t xml:space="preserve"># Call </w:t>
+      </w:r>
+      <w:proofErr w:type="spellStart"/>
+      <w:r>
+        <w:t>my_</w:t>
+      </w:r>
+      <w:proofErr w:type="gramStart"/>
+      <w:r>
+        <w:t>function</w:t>
+      </w:r>
+      <w:proofErr w:type="spellEnd"/>
+      <w:r>
+        <w:t>(</w:t>
+      </w:r>
+      <w:proofErr w:type="gramEnd"/>
+      <w:r>
+        <w:t>): printing "Hello from a function".</w:t>
+      </w:r>
+    </w:p>
+    <w:p>
+      <w:pPr>
+        <w:pStyle w:val="NoSpacing"/>
+      </w:pPr>
+    </w:p>
+    <w:p>
+      <w:pPr>
+        <w:pStyle w:val="NoSpacing"/>
+      </w:pPr>
+    </w:p>
+    <w:p>
+      <w:pPr>
+        <w:pStyle w:val="NoSpacing"/>
+      </w:pPr>
+    </w:p>
+    <w:p>
+      <w:pPr>
+        <w:pStyle w:val="NoSpacing"/>
+        <w:rPr>
+          <w:b/>
+          <w:bCs/>
+          <w:sz w:val="44"/>
+          <w:szCs w:val="44"/>
+          <w:u w:val="single"/>
+        </w:rPr>
+      </w:pPr>
+      <w:r>
+        <w:rPr>
+          <w:b/>
+          <w:bCs/>
+          <w:sz w:val="44"/>
+          <w:szCs w:val="44"/>
+          <w:u w:val="single"/>
+        </w:rPr>
+        <w:lastRenderedPageBreak/>
+        <w:t>Function With Single Parameter</w:t>
+      </w:r>
+    </w:p>
+    <w:p>
+      <w:pPr>
+        <w:pStyle w:val="NoSpacing"/>
+      </w:pPr>
+      <w:r>
+        <w:t>Functions can accept parameters, making them flexible and reusable. A parameter allows different values to be passed into a function when called. Functions with parameters help avoid hardcoding values, allowing dynamic and reusable code in Python.</w:t>
+      </w:r>
+    </w:p>
+    <w:p>
+      <w:pPr>
+        <w:pStyle w:val="NoSpacing"/>
+      </w:pPr>
+      <w:r>
+        <w:rPr>
+          <w:b/>
+          <w:bCs/>
+        </w:rPr>
+        <w:t>Syntax</w:t>
+      </w:r>
+    </w:p>
+    <w:p>
+      <w:pPr>
+        <w:pStyle w:val="NoSpacing"/>
+      </w:pPr>
+      <w:r>
+        <w:t>You can define a function with parameters using the def keyword, followed by the function name and parentheses (), which contain the parameter.</w:t>
+      </w:r>
+    </w:p>
+    <w:p>
+      <w:pPr>
+        <w:pStyle w:val="NoSpacing"/>
+      </w:pPr>
+    </w:p>
+    <w:p>
+      <w:pPr>
+        <w:pStyle w:val="NoSpacing"/>
+      </w:pPr>
+      <w:r>
+        <w:rPr>
+          <w:b/>
+          <w:bCs/>
+        </w:rPr>
+        <w:t>Example</w:t>
+      </w:r>
+      <w:r>
+        <w:t>:</w:t>
+      </w:r>
+    </w:p>
+    <w:p>
+      <w:pPr>
+        <w:pStyle w:val="NoSpacing"/>
+      </w:pPr>
+      <w:r>
+        <w:t># Define a function named 'greet' that takes a parameter 'name'</w:t>
+      </w:r>
+    </w:p>
+    <w:p>
+      <w:pPr>
+        <w:pStyle w:val="NoSpacing"/>
+        <w:rPr>
+          <w:highlight w:val="yellow"/>
+        </w:rPr>
+      </w:pPr>
+      <w:r>
+        <w:rPr>
+          <w:highlight w:val="yellow"/>
+        </w:rPr>
+        <w:t>def greet(name):</w:t>
+      </w:r>
+    </w:p>
+    <w:p>
+      <w:pPr>
+        <w:pStyle w:val="NoSpacing"/>
+        <w:rPr>
+          <w:highlight w:val="yellow"/>
+        </w:rPr>
+      </w:pPr>
+      <w:r>
+        <w:rPr>
+          <w:highlight w:val="yellow"/>
+        </w:rPr>
+        <w:t xml:space="preserve">    # Print a greeting message using string formatting to include the 'name' parameter</w:t>
+      </w:r>
+    </w:p>
+    <w:p>
+      <w:pPr>
+        <w:pStyle w:val="NoSpacing"/>
+        <w:rPr>
+          <w:highlight w:val="yellow"/>
+        </w:rPr>
+      </w:pPr>
+      <w:r>
+        <w:rPr>
+          <w:highlight w:val="yellow"/>
+        </w:rPr>
+        <w:t xml:space="preserve">    </w:t>
+      </w:r>
+      <w:proofErr w:type="gramStart"/>
+      <w:r>
+        <w:rPr>
+          <w:highlight w:val="yellow"/>
+        </w:rPr>
+        <w:t>print(</w:t>
+      </w:r>
+      <w:proofErr w:type="spellStart"/>
+      <w:proofErr w:type="gramEnd"/>
+      <w:r>
+        <w:rPr>
+          <w:highlight w:val="yellow"/>
+        </w:rPr>
+        <w:t>f"Hello</w:t>
+      </w:r>
+      <w:proofErr w:type="spellEnd"/>
+      <w:r>
+        <w:rPr>
+          <w:highlight w:val="yellow"/>
+        </w:rPr>
+        <w:t>, {name}!")  # The f-string allows embedding the value of 'name' into the greeting message</w:t>
+      </w:r>
+    </w:p>
+    <w:p>
+      <w:pPr>
+        <w:pStyle w:val="NoSpacing"/>
+      </w:pPr>
+      <w:r>
+        <w:rPr>
+          <w:highlight w:val="yellow"/>
+        </w:rPr>
+        <w:t>greet("Raj") # Output: Hello, Raj!</w:t>
+      </w:r>
     </w:p>
     <w:p>
       <w:pPr>
@@ -23633,6 +25764,119 @@
     </w:lvl>
   </w:abstractNum>
   <w:abstractNum w:abstractNumId="12" w15:restartNumberingAfterBreak="0">
+    <w:nsid w:val="2BCD16B4"/>
+    <w:multiLevelType w:val="multilevel"/>
+    <w:tmpl w:val="50A09D10"/>
+    <w:lvl w:ilvl="0">
+      <w:start w:val="1"/>
+      <w:numFmt w:val="decimal"/>
+      <w:lvlText w:val="%1."/>
+      <w:lvlJc w:val="left"/>
+      <w:pPr>
+        <w:tabs>
+          <w:tab w:val="num" w:pos="720"/>
+        </w:tabs>
+        <w:ind w:left="720" w:hanging="360"/>
+      </w:pPr>
+    </w:lvl>
+    <w:lvl w:ilvl="1" w:tentative="1">
+      <w:start w:val="1"/>
+      <w:numFmt w:val="decimal"/>
+      <w:lvlText w:val="%2."/>
+      <w:lvlJc w:val="left"/>
+      <w:pPr>
+        <w:tabs>
+          <w:tab w:val="num" w:pos="1440"/>
+        </w:tabs>
+        <w:ind w:left="1440" w:hanging="360"/>
+      </w:pPr>
+    </w:lvl>
+    <w:lvl w:ilvl="2" w:tentative="1">
+      <w:start w:val="1"/>
+      <w:numFmt w:val="decimal"/>
+      <w:lvlText w:val="%3."/>
+      <w:lvlJc w:val="left"/>
+      <w:pPr>
+        <w:tabs>
+          <w:tab w:val="num" w:pos="2160"/>
+        </w:tabs>
+        <w:ind w:left="2160" w:hanging="360"/>
+      </w:pPr>
+    </w:lvl>
+    <w:lvl w:ilvl="3" w:tentative="1">
+      <w:start w:val="1"/>
+      <w:numFmt w:val="decimal"/>
+      <w:lvlText w:val="%4."/>
+      <w:lvlJc w:val="left"/>
+      <w:pPr>
+        <w:tabs>
+          <w:tab w:val="num" w:pos="2880"/>
+        </w:tabs>
+        <w:ind w:left="2880" w:hanging="360"/>
+      </w:pPr>
+    </w:lvl>
+    <w:lvl w:ilvl="4" w:tentative="1">
+      <w:start w:val="1"/>
+      <w:numFmt w:val="decimal"/>
+      <w:lvlText w:val="%5."/>
+      <w:lvlJc w:val="left"/>
+      <w:pPr>
+        <w:tabs>
+          <w:tab w:val="num" w:pos="3600"/>
+        </w:tabs>
+        <w:ind w:left="3600" w:hanging="360"/>
+      </w:pPr>
+    </w:lvl>
+    <w:lvl w:ilvl="5" w:tentative="1">
+      <w:start w:val="1"/>
+      <w:numFmt w:val="decimal"/>
+      <w:lvlText w:val="%6."/>
+      <w:lvlJc w:val="left"/>
+      <w:pPr>
+        <w:tabs>
+          <w:tab w:val="num" w:pos="4320"/>
+        </w:tabs>
+        <w:ind w:left="4320" w:hanging="360"/>
+      </w:pPr>
+    </w:lvl>
+    <w:lvl w:ilvl="6" w:tentative="1">
+      <w:start w:val="1"/>
+      <w:numFmt w:val="decimal"/>
+      <w:lvlText w:val="%7."/>
+      <w:lvlJc w:val="left"/>
+      <w:pPr>
+        <w:tabs>
+          <w:tab w:val="num" w:pos="5040"/>
+        </w:tabs>
+        <w:ind w:left="5040" w:hanging="360"/>
+      </w:pPr>
+    </w:lvl>
+    <w:lvl w:ilvl="7" w:tentative="1">
+      <w:start w:val="1"/>
+      <w:numFmt w:val="decimal"/>
+      <w:lvlText w:val="%8."/>
+      <w:lvlJc w:val="left"/>
+      <w:pPr>
+        <w:tabs>
+          <w:tab w:val="num" w:pos="5760"/>
+        </w:tabs>
+        <w:ind w:left="5760" w:hanging="360"/>
+      </w:pPr>
+    </w:lvl>
+    <w:lvl w:ilvl="8" w:tentative="1">
+      <w:start w:val="1"/>
+      <w:numFmt w:val="decimal"/>
+      <w:lvlText w:val="%9."/>
+      <w:lvlJc w:val="left"/>
+      <w:pPr>
+        <w:tabs>
+          <w:tab w:val="num" w:pos="6480"/>
+        </w:tabs>
+        <w:ind w:left="6480" w:hanging="360"/>
+      </w:pPr>
+    </w:lvl>
+  </w:abstractNum>
+  <w:abstractNum w:abstractNumId="13" w15:restartNumberingAfterBreak="0">
     <w:nsid w:val="2E1929BA"/>
     <w:multiLevelType w:val="multilevel"/>
     <w:tmpl w:val="E348CA2A"/>
@@ -23745,7 +25989,7 @@
       </w:pPr>
     </w:lvl>
   </w:abstractNum>
-  <w:abstractNum w:abstractNumId="13" w15:restartNumberingAfterBreak="0">
+  <w:abstractNum w:abstractNumId="14" w15:restartNumberingAfterBreak="0">
     <w:nsid w:val="2E4D707D"/>
     <w:multiLevelType w:val="multilevel"/>
     <w:tmpl w:val="6C3EE2EC"/>
@@ -23894,7 +26138,7 @@
       </w:rPr>
     </w:lvl>
   </w:abstractNum>
-  <w:abstractNum w:abstractNumId="14" w15:restartNumberingAfterBreak="0">
+  <w:abstractNum w:abstractNumId="15" w15:restartNumberingAfterBreak="0">
     <w:nsid w:val="30C40687"/>
     <w:multiLevelType w:val="multilevel"/>
     <w:tmpl w:val="56B27E2C"/>
@@ -24011,7 +26255,7 @@
       </w:pPr>
     </w:lvl>
   </w:abstractNum>
-  <w:abstractNum w:abstractNumId="15" w15:restartNumberingAfterBreak="0">
+  <w:abstractNum w:abstractNumId="16" w15:restartNumberingAfterBreak="0">
     <w:nsid w:val="325E0CD4"/>
     <w:multiLevelType w:val="multilevel"/>
     <w:tmpl w:val="9FAE4238"/>
@@ -24124,7 +26368,156 @@
       </w:pPr>
     </w:lvl>
   </w:abstractNum>
-  <w:abstractNum w:abstractNumId="16" w15:restartNumberingAfterBreak="0">
+  <w:abstractNum w:abstractNumId="17" w15:restartNumberingAfterBreak="0">
+    <w:nsid w:val="33BC613C"/>
+    <w:multiLevelType w:val="multilevel"/>
+    <w:tmpl w:val="1714CAA8"/>
+    <w:lvl w:ilvl="0">
+      <w:start w:val="1"/>
+      <w:numFmt w:val="bullet"/>
+      <w:lvlText w:val=""/>
+      <w:lvlJc w:val="left"/>
+      <w:pPr>
+        <w:tabs>
+          <w:tab w:val="num" w:pos="720"/>
+        </w:tabs>
+        <w:ind w:left="720" w:hanging="360"/>
+      </w:pPr>
+      <w:rPr>
+        <w:rFonts w:ascii="Symbol" w:hAnsi="Symbol" w:hint="default"/>
+        <w:sz w:val="20"/>
+      </w:rPr>
+    </w:lvl>
+    <w:lvl w:ilvl="1" w:tentative="1">
+      <w:start w:val="1"/>
+      <w:numFmt w:val="bullet"/>
+      <w:lvlText w:val="o"/>
+      <w:lvlJc w:val="left"/>
+      <w:pPr>
+        <w:tabs>
+          <w:tab w:val="num" w:pos="1440"/>
+        </w:tabs>
+        <w:ind w:left="1440" w:hanging="360"/>
+      </w:pPr>
+      <w:rPr>
+        <w:rFonts w:ascii="Courier New" w:hAnsi="Courier New" w:hint="default"/>
+        <w:sz w:val="20"/>
+      </w:rPr>
+    </w:lvl>
+    <w:lvl w:ilvl="2" w:tentative="1">
+      <w:start w:val="1"/>
+      <w:numFmt w:val="bullet"/>
+      <w:lvlText w:val=""/>
+      <w:lvlJc w:val="left"/>
+      <w:pPr>
+        <w:tabs>
+          <w:tab w:val="num" w:pos="2160"/>
+        </w:tabs>
+        <w:ind w:left="2160" w:hanging="360"/>
+      </w:pPr>
+      <w:rPr>
+        <w:rFonts w:ascii="Wingdings" w:hAnsi="Wingdings" w:hint="default"/>
+        <w:sz w:val="20"/>
+      </w:rPr>
+    </w:lvl>
+    <w:lvl w:ilvl="3" w:tentative="1">
+      <w:start w:val="1"/>
+      <w:numFmt w:val="bullet"/>
+      <w:lvlText w:val=""/>
+      <w:lvlJc w:val="left"/>
+      <w:pPr>
+        <w:tabs>
+          <w:tab w:val="num" w:pos="2880"/>
+        </w:tabs>
+        <w:ind w:left="2880" w:hanging="360"/>
+      </w:pPr>
+      <w:rPr>
+        <w:rFonts w:ascii="Wingdings" w:hAnsi="Wingdings" w:hint="default"/>
+        <w:sz w:val="20"/>
+      </w:rPr>
+    </w:lvl>
+    <w:lvl w:ilvl="4" w:tentative="1">
+      <w:start w:val="1"/>
+      <w:numFmt w:val="bullet"/>
+      <w:lvlText w:val=""/>
+      <w:lvlJc w:val="left"/>
+      <w:pPr>
+        <w:tabs>
+          <w:tab w:val="num" w:pos="3600"/>
+        </w:tabs>
+        <w:ind w:left="3600" w:hanging="360"/>
+      </w:pPr>
+      <w:rPr>
+        <w:rFonts w:ascii="Wingdings" w:hAnsi="Wingdings" w:hint="default"/>
+        <w:sz w:val="20"/>
+      </w:rPr>
+    </w:lvl>
+    <w:lvl w:ilvl="5" w:tentative="1">
+      <w:start w:val="1"/>
+      <w:numFmt w:val="bullet"/>
+      <w:lvlText w:val=""/>
+      <w:lvlJc w:val="left"/>
+      <w:pPr>
+        <w:tabs>
+          <w:tab w:val="num" w:pos="4320"/>
+        </w:tabs>
+        <w:ind w:left="4320" w:hanging="360"/>
+      </w:pPr>
+      <w:rPr>
+        <w:rFonts w:ascii="Wingdings" w:hAnsi="Wingdings" w:hint="default"/>
+        <w:sz w:val="20"/>
+      </w:rPr>
+    </w:lvl>
+    <w:lvl w:ilvl="6" w:tentative="1">
+      <w:start w:val="1"/>
+      <w:numFmt w:val="bullet"/>
+      <w:lvlText w:val=""/>
+      <w:lvlJc w:val="left"/>
+      <w:pPr>
+        <w:tabs>
+          <w:tab w:val="num" w:pos="5040"/>
+        </w:tabs>
+        <w:ind w:left="5040" w:hanging="360"/>
+      </w:pPr>
+      <w:rPr>
+        <w:rFonts w:ascii="Wingdings" w:hAnsi="Wingdings" w:hint="default"/>
+        <w:sz w:val="20"/>
+      </w:rPr>
+    </w:lvl>
+    <w:lvl w:ilvl="7" w:tentative="1">
+      <w:start w:val="1"/>
+      <w:numFmt w:val="bullet"/>
+      <w:lvlText w:val=""/>
+      <w:lvlJc w:val="left"/>
+      <w:pPr>
+        <w:tabs>
+          <w:tab w:val="num" w:pos="5760"/>
+        </w:tabs>
+        <w:ind w:left="5760" w:hanging="360"/>
+      </w:pPr>
+      <w:rPr>
+        <w:rFonts w:ascii="Wingdings" w:hAnsi="Wingdings" w:hint="default"/>
+        <w:sz w:val="20"/>
+      </w:rPr>
+    </w:lvl>
+    <w:lvl w:ilvl="8" w:tentative="1">
+      <w:start w:val="1"/>
+      <w:numFmt w:val="bullet"/>
+      <w:lvlText w:val=""/>
+      <w:lvlJc w:val="left"/>
+      <w:pPr>
+        <w:tabs>
+          <w:tab w:val="num" w:pos="6480"/>
+        </w:tabs>
+        <w:ind w:left="6480" w:hanging="360"/>
+      </w:pPr>
+      <w:rPr>
+        <w:rFonts w:ascii="Wingdings" w:hAnsi="Wingdings" w:hint="default"/>
+        <w:sz w:val="20"/>
+      </w:rPr>
+    </w:lvl>
+  </w:abstractNum>
+  <w:abstractNum w:abstractNumId="18" w15:restartNumberingAfterBreak="0">
     <w:nsid w:val="34DF0C8A"/>
     <w:multiLevelType w:val="multilevel"/>
     <w:tmpl w:val="5F686C06"/>
@@ -24237,7 +26630,7 @@
       </w:pPr>
     </w:lvl>
   </w:abstractNum>
-  <w:abstractNum w:abstractNumId="17" w15:restartNumberingAfterBreak="0">
+  <w:abstractNum w:abstractNumId="19" w15:restartNumberingAfterBreak="0">
     <w:nsid w:val="3C5F48D4"/>
     <w:multiLevelType w:val="multilevel"/>
     <w:tmpl w:val="4420D816"/>
@@ -24350,7 +26743,7 @@
       </w:pPr>
     </w:lvl>
   </w:abstractNum>
-  <w:abstractNum w:abstractNumId="18" w15:restartNumberingAfterBreak="0">
+  <w:abstractNum w:abstractNumId="20" w15:restartNumberingAfterBreak="0">
     <w:nsid w:val="40147520"/>
     <w:multiLevelType w:val="multilevel"/>
     <w:tmpl w:val="40AC8DBA"/>
@@ -24463,7 +26856,7 @@
       </w:pPr>
     </w:lvl>
   </w:abstractNum>
-  <w:abstractNum w:abstractNumId="19" w15:restartNumberingAfterBreak="0">
+  <w:abstractNum w:abstractNumId="21" w15:restartNumberingAfterBreak="0">
     <w:nsid w:val="409F50EB"/>
     <w:multiLevelType w:val="multilevel"/>
     <w:tmpl w:val="3B5EED9A"/>
@@ -24576,7 +26969,7 @@
       </w:pPr>
     </w:lvl>
   </w:abstractNum>
-  <w:abstractNum w:abstractNumId="20" w15:restartNumberingAfterBreak="0">
+  <w:abstractNum w:abstractNumId="22" w15:restartNumberingAfterBreak="0">
     <w:nsid w:val="442A2F32"/>
     <w:multiLevelType w:val="multilevel"/>
     <w:tmpl w:val="A8C4D96C"/>
@@ -24725,7 +27118,120 @@
       </w:rPr>
     </w:lvl>
   </w:abstractNum>
-  <w:abstractNum w:abstractNumId="21" w15:restartNumberingAfterBreak="0">
+  <w:abstractNum w:abstractNumId="23" w15:restartNumberingAfterBreak="0">
+    <w:nsid w:val="45BB6B9A"/>
+    <w:multiLevelType w:val="multilevel"/>
+    <w:tmpl w:val="69A8B314"/>
+    <w:lvl w:ilvl="0">
+      <w:start w:val="1"/>
+      <w:numFmt w:val="decimal"/>
+      <w:lvlText w:val="%1."/>
+      <w:lvlJc w:val="left"/>
+      <w:pPr>
+        <w:tabs>
+          <w:tab w:val="num" w:pos="720"/>
+        </w:tabs>
+        <w:ind w:left="720" w:hanging="360"/>
+      </w:pPr>
+    </w:lvl>
+    <w:lvl w:ilvl="1" w:tentative="1">
+      <w:start w:val="1"/>
+      <w:numFmt w:val="decimal"/>
+      <w:lvlText w:val="%2."/>
+      <w:lvlJc w:val="left"/>
+      <w:pPr>
+        <w:tabs>
+          <w:tab w:val="num" w:pos="1440"/>
+        </w:tabs>
+        <w:ind w:left="1440" w:hanging="360"/>
+      </w:pPr>
+    </w:lvl>
+    <w:lvl w:ilvl="2" w:tentative="1">
+      <w:start w:val="1"/>
+      <w:numFmt w:val="decimal"/>
+      <w:lvlText w:val="%3."/>
+      <w:lvlJc w:val="left"/>
+      <w:pPr>
+        <w:tabs>
+          <w:tab w:val="num" w:pos="2160"/>
+        </w:tabs>
+        <w:ind w:left="2160" w:hanging="360"/>
+      </w:pPr>
+    </w:lvl>
+    <w:lvl w:ilvl="3" w:tentative="1">
+      <w:start w:val="1"/>
+      <w:numFmt w:val="decimal"/>
+      <w:lvlText w:val="%4."/>
+      <w:lvlJc w:val="left"/>
+      <w:pPr>
+        <w:tabs>
+          <w:tab w:val="num" w:pos="2880"/>
+        </w:tabs>
+        <w:ind w:left="2880" w:hanging="360"/>
+      </w:pPr>
+    </w:lvl>
+    <w:lvl w:ilvl="4" w:tentative="1">
+      <w:start w:val="1"/>
+      <w:numFmt w:val="decimal"/>
+      <w:lvlText w:val="%5."/>
+      <w:lvlJc w:val="left"/>
+      <w:pPr>
+        <w:tabs>
+          <w:tab w:val="num" w:pos="3600"/>
+        </w:tabs>
+        <w:ind w:left="3600" w:hanging="360"/>
+      </w:pPr>
+    </w:lvl>
+    <w:lvl w:ilvl="5" w:tentative="1">
+      <w:start w:val="1"/>
+      <w:numFmt w:val="decimal"/>
+      <w:lvlText w:val="%6."/>
+      <w:lvlJc w:val="left"/>
+      <w:pPr>
+        <w:tabs>
+          <w:tab w:val="num" w:pos="4320"/>
+        </w:tabs>
+        <w:ind w:left="4320" w:hanging="360"/>
+      </w:pPr>
+    </w:lvl>
+    <w:lvl w:ilvl="6" w:tentative="1">
+      <w:start w:val="1"/>
+      <w:numFmt w:val="decimal"/>
+      <w:lvlText w:val="%7."/>
+      <w:lvlJc w:val="left"/>
+      <w:pPr>
+        <w:tabs>
+          <w:tab w:val="num" w:pos="5040"/>
+        </w:tabs>
+        <w:ind w:left="5040" w:hanging="360"/>
+      </w:pPr>
+    </w:lvl>
+    <w:lvl w:ilvl="7" w:tentative="1">
+      <w:start w:val="1"/>
+      <w:numFmt w:val="decimal"/>
+      <w:lvlText w:val="%8."/>
+      <w:lvlJc w:val="left"/>
+      <w:pPr>
+        <w:tabs>
+          <w:tab w:val="num" w:pos="5760"/>
+        </w:tabs>
+        <w:ind w:left="5760" w:hanging="360"/>
+      </w:pPr>
+    </w:lvl>
+    <w:lvl w:ilvl="8" w:tentative="1">
+      <w:start w:val="1"/>
+      <w:numFmt w:val="decimal"/>
+      <w:lvlText w:val="%9."/>
+      <w:lvlJc w:val="left"/>
+      <w:pPr>
+        <w:tabs>
+          <w:tab w:val="num" w:pos="6480"/>
+        </w:tabs>
+        <w:ind w:left="6480" w:hanging="360"/>
+      </w:pPr>
+    </w:lvl>
+  </w:abstractNum>
+  <w:abstractNum w:abstractNumId="24" w15:restartNumberingAfterBreak="0">
     <w:nsid w:val="45F0383B"/>
     <w:multiLevelType w:val="multilevel"/>
     <w:tmpl w:val="E2D83D6C"/>
@@ -24838,7 +27344,233 @@
       </w:pPr>
     </w:lvl>
   </w:abstractNum>
-  <w:abstractNum w:abstractNumId="22" w15:restartNumberingAfterBreak="0">
+  <w:abstractNum w:abstractNumId="25" w15:restartNumberingAfterBreak="0">
+    <w:nsid w:val="47E43887"/>
+    <w:multiLevelType w:val="multilevel"/>
+    <w:tmpl w:val="9AB46C98"/>
+    <w:lvl w:ilvl="0">
+      <w:start w:val="1"/>
+      <w:numFmt w:val="decimal"/>
+      <w:lvlText w:val="%1."/>
+      <w:lvlJc w:val="left"/>
+      <w:pPr>
+        <w:tabs>
+          <w:tab w:val="num" w:pos="720"/>
+        </w:tabs>
+        <w:ind w:left="720" w:hanging="360"/>
+      </w:pPr>
+    </w:lvl>
+    <w:lvl w:ilvl="1" w:tentative="1">
+      <w:start w:val="1"/>
+      <w:numFmt w:val="decimal"/>
+      <w:lvlText w:val="%2."/>
+      <w:lvlJc w:val="left"/>
+      <w:pPr>
+        <w:tabs>
+          <w:tab w:val="num" w:pos="1440"/>
+        </w:tabs>
+        <w:ind w:left="1440" w:hanging="360"/>
+      </w:pPr>
+    </w:lvl>
+    <w:lvl w:ilvl="2" w:tentative="1">
+      <w:start w:val="1"/>
+      <w:numFmt w:val="decimal"/>
+      <w:lvlText w:val="%3."/>
+      <w:lvlJc w:val="left"/>
+      <w:pPr>
+        <w:tabs>
+          <w:tab w:val="num" w:pos="2160"/>
+        </w:tabs>
+        <w:ind w:left="2160" w:hanging="360"/>
+      </w:pPr>
+    </w:lvl>
+    <w:lvl w:ilvl="3" w:tentative="1">
+      <w:start w:val="1"/>
+      <w:numFmt w:val="decimal"/>
+      <w:lvlText w:val="%4."/>
+      <w:lvlJc w:val="left"/>
+      <w:pPr>
+        <w:tabs>
+          <w:tab w:val="num" w:pos="2880"/>
+        </w:tabs>
+        <w:ind w:left="2880" w:hanging="360"/>
+      </w:pPr>
+    </w:lvl>
+    <w:lvl w:ilvl="4" w:tentative="1">
+      <w:start w:val="1"/>
+      <w:numFmt w:val="decimal"/>
+      <w:lvlText w:val="%5."/>
+      <w:lvlJc w:val="left"/>
+      <w:pPr>
+        <w:tabs>
+          <w:tab w:val="num" w:pos="3600"/>
+        </w:tabs>
+        <w:ind w:left="3600" w:hanging="360"/>
+      </w:pPr>
+    </w:lvl>
+    <w:lvl w:ilvl="5" w:tentative="1">
+      <w:start w:val="1"/>
+      <w:numFmt w:val="decimal"/>
+      <w:lvlText w:val="%6."/>
+      <w:lvlJc w:val="left"/>
+      <w:pPr>
+        <w:tabs>
+          <w:tab w:val="num" w:pos="4320"/>
+        </w:tabs>
+        <w:ind w:left="4320" w:hanging="360"/>
+      </w:pPr>
+    </w:lvl>
+    <w:lvl w:ilvl="6" w:tentative="1">
+      <w:start w:val="1"/>
+      <w:numFmt w:val="decimal"/>
+      <w:lvlText w:val="%7."/>
+      <w:lvlJc w:val="left"/>
+      <w:pPr>
+        <w:tabs>
+          <w:tab w:val="num" w:pos="5040"/>
+        </w:tabs>
+        <w:ind w:left="5040" w:hanging="360"/>
+      </w:pPr>
+    </w:lvl>
+    <w:lvl w:ilvl="7" w:tentative="1">
+      <w:start w:val="1"/>
+      <w:numFmt w:val="decimal"/>
+      <w:lvlText w:val="%8."/>
+      <w:lvlJc w:val="left"/>
+      <w:pPr>
+        <w:tabs>
+          <w:tab w:val="num" w:pos="5760"/>
+        </w:tabs>
+        <w:ind w:left="5760" w:hanging="360"/>
+      </w:pPr>
+    </w:lvl>
+    <w:lvl w:ilvl="8" w:tentative="1">
+      <w:start w:val="1"/>
+      <w:numFmt w:val="decimal"/>
+      <w:lvlText w:val="%9."/>
+      <w:lvlJc w:val="left"/>
+      <w:pPr>
+        <w:tabs>
+          <w:tab w:val="num" w:pos="6480"/>
+        </w:tabs>
+        <w:ind w:left="6480" w:hanging="360"/>
+      </w:pPr>
+    </w:lvl>
+  </w:abstractNum>
+  <w:abstractNum w:abstractNumId="26" w15:restartNumberingAfterBreak="0">
+    <w:nsid w:val="48291F9F"/>
+    <w:multiLevelType w:val="multilevel"/>
+    <w:tmpl w:val="84A66160"/>
+    <w:lvl w:ilvl="0">
+      <w:start w:val="2"/>
+      <w:numFmt w:val="decimal"/>
+      <w:lvlText w:val="%1."/>
+      <w:lvlJc w:val="left"/>
+      <w:pPr>
+        <w:tabs>
+          <w:tab w:val="num" w:pos="720"/>
+        </w:tabs>
+        <w:ind w:left="720" w:hanging="360"/>
+      </w:pPr>
+    </w:lvl>
+    <w:lvl w:ilvl="1" w:tentative="1">
+      <w:start w:val="1"/>
+      <w:numFmt w:val="decimal"/>
+      <w:lvlText w:val="%2."/>
+      <w:lvlJc w:val="left"/>
+      <w:pPr>
+        <w:tabs>
+          <w:tab w:val="num" w:pos="1440"/>
+        </w:tabs>
+        <w:ind w:left="1440" w:hanging="360"/>
+      </w:pPr>
+    </w:lvl>
+    <w:lvl w:ilvl="2" w:tentative="1">
+      <w:start w:val="1"/>
+      <w:numFmt w:val="decimal"/>
+      <w:lvlText w:val="%3."/>
+      <w:lvlJc w:val="left"/>
+      <w:pPr>
+        <w:tabs>
+          <w:tab w:val="num" w:pos="2160"/>
+        </w:tabs>
+        <w:ind w:left="2160" w:hanging="360"/>
+      </w:pPr>
+    </w:lvl>
+    <w:lvl w:ilvl="3" w:tentative="1">
+      <w:start w:val="1"/>
+      <w:numFmt w:val="decimal"/>
+      <w:lvlText w:val="%4."/>
+      <w:lvlJc w:val="left"/>
+      <w:pPr>
+        <w:tabs>
+          <w:tab w:val="num" w:pos="2880"/>
+        </w:tabs>
+        <w:ind w:left="2880" w:hanging="360"/>
+      </w:pPr>
+    </w:lvl>
+    <w:lvl w:ilvl="4" w:tentative="1">
+      <w:start w:val="1"/>
+      <w:numFmt w:val="decimal"/>
+      <w:lvlText w:val="%5."/>
+      <w:lvlJc w:val="left"/>
+      <w:pPr>
+        <w:tabs>
+          <w:tab w:val="num" w:pos="3600"/>
+        </w:tabs>
+        <w:ind w:left="3600" w:hanging="360"/>
+      </w:pPr>
+    </w:lvl>
+    <w:lvl w:ilvl="5" w:tentative="1">
+      <w:start w:val="1"/>
+      <w:numFmt w:val="decimal"/>
+      <w:lvlText w:val="%6."/>
+      <w:lvlJc w:val="left"/>
+      <w:pPr>
+        <w:tabs>
+          <w:tab w:val="num" w:pos="4320"/>
+        </w:tabs>
+        <w:ind w:left="4320" w:hanging="360"/>
+      </w:pPr>
+    </w:lvl>
+    <w:lvl w:ilvl="6" w:tentative="1">
+      <w:start w:val="1"/>
+      <w:numFmt w:val="decimal"/>
+      <w:lvlText w:val="%7."/>
+      <w:lvlJc w:val="left"/>
+      <w:pPr>
+        <w:tabs>
+          <w:tab w:val="num" w:pos="5040"/>
+        </w:tabs>
+        <w:ind w:left="5040" w:hanging="360"/>
+      </w:pPr>
+    </w:lvl>
+    <w:lvl w:ilvl="7" w:tentative="1">
+      <w:start w:val="1"/>
+      <w:numFmt w:val="decimal"/>
+      <w:lvlText w:val="%8."/>
+      <w:lvlJc w:val="left"/>
+      <w:pPr>
+        <w:tabs>
+          <w:tab w:val="num" w:pos="5760"/>
+        </w:tabs>
+        <w:ind w:left="5760" w:hanging="360"/>
+      </w:pPr>
+    </w:lvl>
+    <w:lvl w:ilvl="8" w:tentative="1">
+      <w:start w:val="1"/>
+      <w:numFmt w:val="decimal"/>
+      <w:lvlText w:val="%9."/>
+      <w:lvlJc w:val="left"/>
+      <w:pPr>
+        <w:tabs>
+          <w:tab w:val="num" w:pos="6480"/>
+        </w:tabs>
+        <w:ind w:left="6480" w:hanging="360"/>
+      </w:pPr>
+    </w:lvl>
+  </w:abstractNum>
+  <w:abstractNum w:abstractNumId="27" w15:restartNumberingAfterBreak="0">
     <w:nsid w:val="48CA4330"/>
     <w:multiLevelType w:val="multilevel"/>
     <w:tmpl w:val="7D78E2EA"/>
@@ -24987,7 +27719,7 @@
       </w:rPr>
     </w:lvl>
   </w:abstractNum>
-  <w:abstractNum w:abstractNumId="23" w15:restartNumberingAfterBreak="0">
+  <w:abstractNum w:abstractNumId="28" w15:restartNumberingAfterBreak="0">
     <w:nsid w:val="4AA1384F"/>
     <w:multiLevelType w:val="hybridMultilevel"/>
     <w:tmpl w:val="19F07A54"/>
@@ -25099,7 +27831,7 @@
       </w:rPr>
     </w:lvl>
   </w:abstractNum>
-  <w:abstractNum w:abstractNumId="24" w15:restartNumberingAfterBreak="0">
+  <w:abstractNum w:abstractNumId="29" w15:restartNumberingAfterBreak="0">
     <w:nsid w:val="4EDD47EE"/>
     <w:multiLevelType w:val="multilevel"/>
     <w:tmpl w:val="6A165A54"/>
@@ -25248,7 +27980,7 @@
       </w:rPr>
     </w:lvl>
   </w:abstractNum>
-  <w:abstractNum w:abstractNumId="25" w15:restartNumberingAfterBreak="0">
+  <w:abstractNum w:abstractNumId="30" w15:restartNumberingAfterBreak="0">
     <w:nsid w:val="53B03E51"/>
     <w:multiLevelType w:val="multilevel"/>
     <w:tmpl w:val="CFB4CA4C"/>
@@ -25397,7 +28129,7 @@
       </w:rPr>
     </w:lvl>
   </w:abstractNum>
-  <w:abstractNum w:abstractNumId="26" w15:restartNumberingAfterBreak="0">
+  <w:abstractNum w:abstractNumId="31" w15:restartNumberingAfterBreak="0">
     <w:nsid w:val="547C4E7C"/>
     <w:multiLevelType w:val="multilevel"/>
     <w:tmpl w:val="418E4F8E"/>
@@ -25510,7 +28242,7 @@
       </w:pPr>
     </w:lvl>
   </w:abstractNum>
-  <w:abstractNum w:abstractNumId="27" w15:restartNumberingAfterBreak="0">
+  <w:abstractNum w:abstractNumId="32" w15:restartNumberingAfterBreak="0">
     <w:nsid w:val="5C6961C7"/>
     <w:multiLevelType w:val="multilevel"/>
     <w:tmpl w:val="B47ED35A"/>
@@ -25623,7 +28355,7 @@
       </w:pPr>
     </w:lvl>
   </w:abstractNum>
-  <w:abstractNum w:abstractNumId="28" w15:restartNumberingAfterBreak="0">
+  <w:abstractNum w:abstractNumId="33" w15:restartNumberingAfterBreak="0">
     <w:nsid w:val="5D5B39ED"/>
     <w:multiLevelType w:val="multilevel"/>
     <w:tmpl w:val="D3DEA110"/>
@@ -25772,7 +28504,7 @@
       </w:rPr>
     </w:lvl>
   </w:abstractNum>
-  <w:abstractNum w:abstractNumId="29" w15:restartNumberingAfterBreak="0">
+  <w:abstractNum w:abstractNumId="34" w15:restartNumberingAfterBreak="0">
     <w:nsid w:val="5E1508D5"/>
     <w:multiLevelType w:val="multilevel"/>
     <w:tmpl w:val="094CE73C"/>
@@ -25885,7 +28617,120 @@
       </w:pPr>
     </w:lvl>
   </w:abstractNum>
-  <w:abstractNum w:abstractNumId="30" w15:restartNumberingAfterBreak="0">
+  <w:abstractNum w:abstractNumId="35" w15:restartNumberingAfterBreak="0">
+    <w:nsid w:val="5E4A7AFB"/>
+    <w:multiLevelType w:val="multilevel"/>
+    <w:tmpl w:val="78FCEF5E"/>
+    <w:lvl w:ilvl="0">
+      <w:start w:val="3"/>
+      <w:numFmt w:val="decimal"/>
+      <w:lvlText w:val="%1."/>
+      <w:lvlJc w:val="left"/>
+      <w:pPr>
+        <w:tabs>
+          <w:tab w:val="num" w:pos="720"/>
+        </w:tabs>
+        <w:ind w:left="720" w:hanging="360"/>
+      </w:pPr>
+    </w:lvl>
+    <w:lvl w:ilvl="1" w:tentative="1">
+      <w:start w:val="1"/>
+      <w:numFmt w:val="decimal"/>
+      <w:lvlText w:val="%2."/>
+      <w:lvlJc w:val="left"/>
+      <w:pPr>
+        <w:tabs>
+          <w:tab w:val="num" w:pos="1440"/>
+        </w:tabs>
+        <w:ind w:left="1440" w:hanging="360"/>
+      </w:pPr>
+    </w:lvl>
+    <w:lvl w:ilvl="2" w:tentative="1">
+      <w:start w:val="1"/>
+      <w:numFmt w:val="decimal"/>
+      <w:lvlText w:val="%3."/>
+      <w:lvlJc w:val="left"/>
+      <w:pPr>
+        <w:tabs>
+          <w:tab w:val="num" w:pos="2160"/>
+        </w:tabs>
+        <w:ind w:left="2160" w:hanging="360"/>
+      </w:pPr>
+    </w:lvl>
+    <w:lvl w:ilvl="3" w:tentative="1">
+      <w:start w:val="1"/>
+      <w:numFmt w:val="decimal"/>
+      <w:lvlText w:val="%4."/>
+      <w:lvlJc w:val="left"/>
+      <w:pPr>
+        <w:tabs>
+          <w:tab w:val="num" w:pos="2880"/>
+        </w:tabs>
+        <w:ind w:left="2880" w:hanging="360"/>
+      </w:pPr>
+    </w:lvl>
+    <w:lvl w:ilvl="4" w:tentative="1">
+      <w:start w:val="1"/>
+      <w:numFmt w:val="decimal"/>
+      <w:lvlText w:val="%5."/>
+      <w:lvlJc w:val="left"/>
+      <w:pPr>
+        <w:tabs>
+          <w:tab w:val="num" w:pos="3600"/>
+        </w:tabs>
+        <w:ind w:left="3600" w:hanging="360"/>
+      </w:pPr>
+    </w:lvl>
+    <w:lvl w:ilvl="5" w:tentative="1">
+      <w:start w:val="1"/>
+      <w:numFmt w:val="decimal"/>
+      <w:lvlText w:val="%6."/>
+      <w:lvlJc w:val="left"/>
+      <w:pPr>
+        <w:tabs>
+          <w:tab w:val="num" w:pos="4320"/>
+        </w:tabs>
+        <w:ind w:left="4320" w:hanging="360"/>
+      </w:pPr>
+    </w:lvl>
+    <w:lvl w:ilvl="6" w:tentative="1">
+      <w:start w:val="1"/>
+      <w:numFmt w:val="decimal"/>
+      <w:lvlText w:val="%7."/>
+      <w:lvlJc w:val="left"/>
+      <w:pPr>
+        <w:tabs>
+          <w:tab w:val="num" w:pos="5040"/>
+        </w:tabs>
+        <w:ind w:left="5040" w:hanging="360"/>
+      </w:pPr>
+    </w:lvl>
+    <w:lvl w:ilvl="7" w:tentative="1">
+      <w:start w:val="1"/>
+      <w:numFmt w:val="decimal"/>
+      <w:lvlText w:val="%8."/>
+      <w:lvlJc w:val="left"/>
+      <w:pPr>
+        <w:tabs>
+          <w:tab w:val="num" w:pos="5760"/>
+        </w:tabs>
+        <w:ind w:left="5760" w:hanging="360"/>
+      </w:pPr>
+    </w:lvl>
+    <w:lvl w:ilvl="8" w:tentative="1">
+      <w:start w:val="1"/>
+      <w:numFmt w:val="decimal"/>
+      <w:lvlText w:val="%9."/>
+      <w:lvlJc w:val="left"/>
+      <w:pPr>
+        <w:tabs>
+          <w:tab w:val="num" w:pos="6480"/>
+        </w:tabs>
+        <w:ind w:left="6480" w:hanging="360"/>
+      </w:pPr>
+    </w:lvl>
+  </w:abstractNum>
+  <w:abstractNum w:abstractNumId="36" w15:restartNumberingAfterBreak="0">
     <w:nsid w:val="5E716A6A"/>
     <w:multiLevelType w:val="multilevel"/>
     <w:tmpl w:val="44747422"/>
@@ -25998,7 +28843,7 @@
       </w:pPr>
     </w:lvl>
   </w:abstractNum>
-  <w:abstractNum w:abstractNumId="31" w15:restartNumberingAfterBreak="0">
+  <w:abstractNum w:abstractNumId="37" w15:restartNumberingAfterBreak="0">
     <w:nsid w:val="5F145FEC"/>
     <w:multiLevelType w:val="multilevel"/>
     <w:tmpl w:val="6916F2E4"/>
@@ -26111,7 +28956,7 @@
       </w:pPr>
     </w:lvl>
   </w:abstractNum>
-  <w:abstractNum w:abstractNumId="32" w15:restartNumberingAfterBreak="0">
+  <w:abstractNum w:abstractNumId="38" w15:restartNumberingAfterBreak="0">
     <w:nsid w:val="638C4BF1"/>
     <w:multiLevelType w:val="multilevel"/>
     <w:tmpl w:val="2FD6B106"/>
@@ -26260,7 +29105,7 @@
       </w:rPr>
     </w:lvl>
   </w:abstractNum>
-  <w:abstractNum w:abstractNumId="33" w15:restartNumberingAfterBreak="0">
+  <w:abstractNum w:abstractNumId="39" w15:restartNumberingAfterBreak="0">
     <w:nsid w:val="65315D8D"/>
     <w:multiLevelType w:val="multilevel"/>
     <w:tmpl w:val="7F72DC50"/>
@@ -26373,7 +29218,7 @@
       </w:pPr>
     </w:lvl>
   </w:abstractNum>
-  <w:abstractNum w:abstractNumId="34" w15:restartNumberingAfterBreak="0">
+  <w:abstractNum w:abstractNumId="40" w15:restartNumberingAfterBreak="0">
     <w:nsid w:val="660238AA"/>
     <w:multiLevelType w:val="multilevel"/>
     <w:tmpl w:val="327E902E"/>
@@ -26486,7 +29331,120 @@
       </w:pPr>
     </w:lvl>
   </w:abstractNum>
-  <w:abstractNum w:abstractNumId="35" w15:restartNumberingAfterBreak="0">
+  <w:abstractNum w:abstractNumId="41" w15:restartNumberingAfterBreak="0">
+    <w:nsid w:val="66B74FB0"/>
+    <w:multiLevelType w:val="multilevel"/>
+    <w:tmpl w:val="D13A590A"/>
+    <w:lvl w:ilvl="0">
+      <w:start w:val="2"/>
+      <w:numFmt w:val="decimal"/>
+      <w:lvlText w:val="%1."/>
+      <w:lvlJc w:val="left"/>
+      <w:pPr>
+        <w:tabs>
+          <w:tab w:val="num" w:pos="720"/>
+        </w:tabs>
+        <w:ind w:left="720" w:hanging="360"/>
+      </w:pPr>
+    </w:lvl>
+    <w:lvl w:ilvl="1" w:tentative="1">
+      <w:start w:val="1"/>
+      <w:numFmt w:val="decimal"/>
+      <w:lvlText w:val="%2."/>
+      <w:lvlJc w:val="left"/>
+      <w:pPr>
+        <w:tabs>
+          <w:tab w:val="num" w:pos="1440"/>
+        </w:tabs>
+        <w:ind w:left="1440" w:hanging="360"/>
+      </w:pPr>
+    </w:lvl>
+    <w:lvl w:ilvl="2" w:tentative="1">
+      <w:start w:val="1"/>
+      <w:numFmt w:val="decimal"/>
+      <w:lvlText w:val="%3."/>
+      <w:lvlJc w:val="left"/>
+      <w:pPr>
+        <w:tabs>
+          <w:tab w:val="num" w:pos="2160"/>
+        </w:tabs>
+        <w:ind w:left="2160" w:hanging="360"/>
+      </w:pPr>
+    </w:lvl>
+    <w:lvl w:ilvl="3" w:tentative="1">
+      <w:start w:val="1"/>
+      <w:numFmt w:val="decimal"/>
+      <w:lvlText w:val="%4."/>
+      <w:lvlJc w:val="left"/>
+      <w:pPr>
+        <w:tabs>
+          <w:tab w:val="num" w:pos="2880"/>
+        </w:tabs>
+        <w:ind w:left="2880" w:hanging="360"/>
+      </w:pPr>
+    </w:lvl>
+    <w:lvl w:ilvl="4" w:tentative="1">
+      <w:start w:val="1"/>
+      <w:numFmt w:val="decimal"/>
+      <w:lvlText w:val="%5."/>
+      <w:lvlJc w:val="left"/>
+      <w:pPr>
+        <w:tabs>
+          <w:tab w:val="num" w:pos="3600"/>
+        </w:tabs>
+        <w:ind w:left="3600" w:hanging="360"/>
+      </w:pPr>
+    </w:lvl>
+    <w:lvl w:ilvl="5" w:tentative="1">
+      <w:start w:val="1"/>
+      <w:numFmt w:val="decimal"/>
+      <w:lvlText w:val="%6."/>
+      <w:lvlJc w:val="left"/>
+      <w:pPr>
+        <w:tabs>
+          <w:tab w:val="num" w:pos="4320"/>
+        </w:tabs>
+        <w:ind w:left="4320" w:hanging="360"/>
+      </w:pPr>
+    </w:lvl>
+    <w:lvl w:ilvl="6" w:tentative="1">
+      <w:start w:val="1"/>
+      <w:numFmt w:val="decimal"/>
+      <w:lvlText w:val="%7."/>
+      <w:lvlJc w:val="left"/>
+      <w:pPr>
+        <w:tabs>
+          <w:tab w:val="num" w:pos="5040"/>
+        </w:tabs>
+        <w:ind w:left="5040" w:hanging="360"/>
+      </w:pPr>
+    </w:lvl>
+    <w:lvl w:ilvl="7" w:tentative="1">
+      <w:start w:val="1"/>
+      <w:numFmt w:val="decimal"/>
+      <w:lvlText w:val="%8."/>
+      <w:lvlJc w:val="left"/>
+      <w:pPr>
+        <w:tabs>
+          <w:tab w:val="num" w:pos="5760"/>
+        </w:tabs>
+        <w:ind w:left="5760" w:hanging="360"/>
+      </w:pPr>
+    </w:lvl>
+    <w:lvl w:ilvl="8" w:tentative="1">
+      <w:start w:val="1"/>
+      <w:numFmt w:val="decimal"/>
+      <w:lvlText w:val="%9."/>
+      <w:lvlJc w:val="left"/>
+      <w:pPr>
+        <w:tabs>
+          <w:tab w:val="num" w:pos="6480"/>
+        </w:tabs>
+        <w:ind w:left="6480" w:hanging="360"/>
+      </w:pPr>
+    </w:lvl>
+  </w:abstractNum>
+  <w:abstractNum w:abstractNumId="42" w15:restartNumberingAfterBreak="0">
     <w:nsid w:val="6AFF0227"/>
     <w:multiLevelType w:val="multilevel"/>
     <w:tmpl w:val="9564A5B6"/>
@@ -26635,7 +29593,7 @@
       </w:rPr>
     </w:lvl>
   </w:abstractNum>
-  <w:abstractNum w:abstractNumId="36" w15:restartNumberingAfterBreak="0">
+  <w:abstractNum w:abstractNumId="43" w15:restartNumberingAfterBreak="0">
     <w:nsid w:val="6B4216F9"/>
     <w:multiLevelType w:val="multilevel"/>
     <w:tmpl w:val="F26A904E"/>
@@ -26748,7 +29706,7 @@
       </w:pPr>
     </w:lvl>
   </w:abstractNum>
-  <w:abstractNum w:abstractNumId="37" w15:restartNumberingAfterBreak="0">
+  <w:abstractNum w:abstractNumId="44" w15:restartNumberingAfterBreak="0">
     <w:nsid w:val="6DB931B2"/>
     <w:multiLevelType w:val="multilevel"/>
     <w:tmpl w:val="92544524"/>
@@ -26897,7 +29855,233 @@
       </w:rPr>
     </w:lvl>
   </w:abstractNum>
-  <w:abstractNum w:abstractNumId="38" w15:restartNumberingAfterBreak="0">
+  <w:abstractNum w:abstractNumId="45" w15:restartNumberingAfterBreak="0">
+    <w:nsid w:val="754F3561"/>
+    <w:multiLevelType w:val="multilevel"/>
+    <w:tmpl w:val="2D6CCEA8"/>
+    <w:lvl w:ilvl="0">
+      <w:start w:val="1"/>
+      <w:numFmt w:val="decimal"/>
+      <w:lvlText w:val="%1."/>
+      <w:lvlJc w:val="left"/>
+      <w:pPr>
+        <w:tabs>
+          <w:tab w:val="num" w:pos="720"/>
+        </w:tabs>
+        <w:ind w:left="720" w:hanging="360"/>
+      </w:pPr>
+    </w:lvl>
+    <w:lvl w:ilvl="1" w:tentative="1">
+      <w:start w:val="1"/>
+      <w:numFmt w:val="decimal"/>
+      <w:lvlText w:val="%2."/>
+      <w:lvlJc w:val="left"/>
+      <w:pPr>
+        <w:tabs>
+          <w:tab w:val="num" w:pos="1440"/>
+        </w:tabs>
+        <w:ind w:left="1440" w:hanging="360"/>
+      </w:pPr>
+    </w:lvl>
+    <w:lvl w:ilvl="2" w:tentative="1">
+      <w:start w:val="1"/>
+      <w:numFmt w:val="decimal"/>
+      <w:lvlText w:val="%3."/>
+      <w:lvlJc w:val="left"/>
+      <w:pPr>
+        <w:tabs>
+          <w:tab w:val="num" w:pos="2160"/>
+        </w:tabs>
+        <w:ind w:left="2160" w:hanging="360"/>
+      </w:pPr>
+    </w:lvl>
+    <w:lvl w:ilvl="3" w:tentative="1">
+      <w:start w:val="1"/>
+      <w:numFmt w:val="decimal"/>
+      <w:lvlText w:val="%4."/>
+      <w:lvlJc w:val="left"/>
+      <w:pPr>
+        <w:tabs>
+          <w:tab w:val="num" w:pos="2880"/>
+        </w:tabs>
+        <w:ind w:left="2880" w:hanging="360"/>
+      </w:pPr>
+    </w:lvl>
+    <w:lvl w:ilvl="4" w:tentative="1">
+      <w:start w:val="1"/>
+      <w:numFmt w:val="decimal"/>
+      <w:lvlText w:val="%5."/>
+      <w:lvlJc w:val="left"/>
+      <w:pPr>
+        <w:tabs>
+          <w:tab w:val="num" w:pos="3600"/>
+        </w:tabs>
+        <w:ind w:left="3600" w:hanging="360"/>
+      </w:pPr>
+    </w:lvl>
+    <w:lvl w:ilvl="5" w:tentative="1">
+      <w:start w:val="1"/>
+      <w:numFmt w:val="decimal"/>
+      <w:lvlText w:val="%6."/>
+      <w:lvlJc w:val="left"/>
+      <w:pPr>
+        <w:tabs>
+          <w:tab w:val="num" w:pos="4320"/>
+        </w:tabs>
+        <w:ind w:left="4320" w:hanging="360"/>
+      </w:pPr>
+    </w:lvl>
+    <w:lvl w:ilvl="6" w:tentative="1">
+      <w:start w:val="1"/>
+      <w:numFmt w:val="decimal"/>
+      <w:lvlText w:val="%7."/>
+      <w:lvlJc w:val="left"/>
+      <w:pPr>
+        <w:tabs>
+          <w:tab w:val="num" w:pos="5040"/>
+        </w:tabs>
+        <w:ind w:left="5040" w:hanging="360"/>
+      </w:pPr>
+    </w:lvl>
+    <w:lvl w:ilvl="7" w:tentative="1">
+      <w:start w:val="1"/>
+      <w:numFmt w:val="decimal"/>
+      <w:lvlText w:val="%8."/>
+      <w:lvlJc w:val="left"/>
+      <w:pPr>
+        <w:tabs>
+          <w:tab w:val="num" w:pos="5760"/>
+        </w:tabs>
+        <w:ind w:left="5760" w:hanging="360"/>
+      </w:pPr>
+    </w:lvl>
+    <w:lvl w:ilvl="8" w:tentative="1">
+      <w:start w:val="1"/>
+      <w:numFmt w:val="decimal"/>
+      <w:lvlText w:val="%9."/>
+      <w:lvlJc w:val="left"/>
+      <w:pPr>
+        <w:tabs>
+          <w:tab w:val="num" w:pos="6480"/>
+        </w:tabs>
+        <w:ind w:left="6480" w:hanging="360"/>
+      </w:pPr>
+    </w:lvl>
+  </w:abstractNum>
+  <w:abstractNum w:abstractNumId="46" w15:restartNumberingAfterBreak="0">
+    <w:nsid w:val="76A622B5"/>
+    <w:multiLevelType w:val="multilevel"/>
+    <w:tmpl w:val="7AD00D8C"/>
+    <w:lvl w:ilvl="0">
+      <w:start w:val="3"/>
+      <w:numFmt w:val="decimal"/>
+      <w:lvlText w:val="%1."/>
+      <w:lvlJc w:val="left"/>
+      <w:pPr>
+        <w:tabs>
+          <w:tab w:val="num" w:pos="720"/>
+        </w:tabs>
+        <w:ind w:left="720" w:hanging="360"/>
+      </w:pPr>
+    </w:lvl>
+    <w:lvl w:ilvl="1" w:tentative="1">
+      <w:start w:val="1"/>
+      <w:numFmt w:val="decimal"/>
+      <w:lvlText w:val="%2."/>
+      <w:lvlJc w:val="left"/>
+      <w:pPr>
+        <w:tabs>
+          <w:tab w:val="num" w:pos="1440"/>
+        </w:tabs>
+        <w:ind w:left="1440" w:hanging="360"/>
+      </w:pPr>
+    </w:lvl>
+    <w:lvl w:ilvl="2" w:tentative="1">
+      <w:start w:val="1"/>
+      <w:numFmt w:val="decimal"/>
+      <w:lvlText w:val="%3."/>
+      <w:lvlJc w:val="left"/>
+      <w:pPr>
+        <w:tabs>
+          <w:tab w:val="num" w:pos="2160"/>
+        </w:tabs>
+        <w:ind w:left="2160" w:hanging="360"/>
+      </w:pPr>
+    </w:lvl>
+    <w:lvl w:ilvl="3" w:tentative="1">
+      <w:start w:val="1"/>
+      <w:numFmt w:val="decimal"/>
+      <w:lvlText w:val="%4."/>
+      <w:lvlJc w:val="left"/>
+      <w:pPr>
+        <w:tabs>
+          <w:tab w:val="num" w:pos="2880"/>
+        </w:tabs>
+        <w:ind w:left="2880" w:hanging="360"/>
+      </w:pPr>
+    </w:lvl>
+    <w:lvl w:ilvl="4" w:tentative="1">
+      <w:start w:val="1"/>
+      <w:numFmt w:val="decimal"/>
+      <w:lvlText w:val="%5."/>
+      <w:lvlJc w:val="left"/>
+      <w:pPr>
+        <w:tabs>
+          <w:tab w:val="num" w:pos="3600"/>
+        </w:tabs>
+        <w:ind w:left="3600" w:hanging="360"/>
+      </w:pPr>
+    </w:lvl>
+    <w:lvl w:ilvl="5" w:tentative="1">
+      <w:start w:val="1"/>
+      <w:numFmt w:val="decimal"/>
+      <w:lvlText w:val="%6."/>
+      <w:lvlJc w:val="left"/>
+      <w:pPr>
+        <w:tabs>
+          <w:tab w:val="num" w:pos="4320"/>
+        </w:tabs>
+        <w:ind w:left="4320" w:hanging="360"/>
+      </w:pPr>
+    </w:lvl>
+    <w:lvl w:ilvl="6" w:tentative="1">
+      <w:start w:val="1"/>
+      <w:numFmt w:val="decimal"/>
+      <w:lvlText w:val="%7."/>
+      <w:lvlJc w:val="left"/>
+      <w:pPr>
+        <w:tabs>
+          <w:tab w:val="num" w:pos="5040"/>
+        </w:tabs>
+        <w:ind w:left="5040" w:hanging="360"/>
+      </w:pPr>
+    </w:lvl>
+    <w:lvl w:ilvl="7" w:tentative="1">
+      <w:start w:val="1"/>
+      <w:numFmt w:val="decimal"/>
+      <w:lvlText w:val="%8."/>
+      <w:lvlJc w:val="left"/>
+      <w:pPr>
+        <w:tabs>
+          <w:tab w:val="num" w:pos="5760"/>
+        </w:tabs>
+        <w:ind w:left="5760" w:hanging="360"/>
+      </w:pPr>
+    </w:lvl>
+    <w:lvl w:ilvl="8" w:tentative="1">
+      <w:start w:val="1"/>
+      <w:numFmt w:val="decimal"/>
+      <w:lvlText w:val="%9."/>
+      <w:lvlJc w:val="left"/>
+      <w:pPr>
+        <w:tabs>
+          <w:tab w:val="num" w:pos="6480"/>
+        </w:tabs>
+        <w:ind w:left="6480" w:hanging="360"/>
+      </w:pPr>
+    </w:lvl>
+  </w:abstractNum>
+  <w:abstractNum w:abstractNumId="47" w15:restartNumberingAfterBreak="0">
     <w:nsid w:val="797D0AAA"/>
     <w:multiLevelType w:val="multilevel"/>
     <w:tmpl w:val="A93CDF4C"/>
@@ -27046,7 +30230,7 @@
       </w:rPr>
     </w:lvl>
   </w:abstractNum>
-  <w:abstractNum w:abstractNumId="39" w15:restartNumberingAfterBreak="0">
+  <w:abstractNum w:abstractNumId="48" w15:restartNumberingAfterBreak="0">
     <w:nsid w:val="79D239C1"/>
     <w:multiLevelType w:val="multilevel"/>
     <w:tmpl w:val="DE4CCDE0"/>
@@ -27195,7 +30379,7 @@
       </w:rPr>
     </w:lvl>
   </w:abstractNum>
-  <w:abstractNum w:abstractNumId="40" w15:restartNumberingAfterBreak="0">
+  <w:abstractNum w:abstractNumId="49" w15:restartNumberingAfterBreak="0">
     <w:nsid w:val="79FD3935"/>
     <w:multiLevelType w:val="multilevel"/>
     <w:tmpl w:val="B07E4A46"/>
@@ -27309,22 +30493,22 @@
     </w:lvl>
   </w:abstractNum>
   <w:num w:numId="1" w16cid:durableId="1325626687">
-    <w:abstractNumId w:val="27"/>
+    <w:abstractNumId w:val="32"/>
   </w:num>
   <w:num w:numId="2" w16cid:durableId="642350065">
-    <w:abstractNumId w:val="23"/>
+    <w:abstractNumId w:val="28"/>
   </w:num>
   <w:num w:numId="3" w16cid:durableId="851190788">
-    <w:abstractNumId w:val="28"/>
+    <w:abstractNumId w:val="33"/>
   </w:num>
   <w:num w:numId="4" w16cid:durableId="572159990">
-    <w:abstractNumId w:val="17"/>
+    <w:abstractNumId w:val="19"/>
   </w:num>
   <w:num w:numId="5" w16cid:durableId="348529448">
     <w:abstractNumId w:val="3"/>
   </w:num>
   <w:num w:numId="6" w16cid:durableId="1489902165">
-    <w:abstractNumId w:val="24"/>
+    <w:abstractNumId w:val="29"/>
   </w:num>
   <w:num w:numId="7" w16cid:durableId="748575999">
     <w:abstractNumId w:val="2"/>
@@ -27333,103 +30517,130 @@
     <w:abstractNumId w:val="9"/>
   </w:num>
   <w:num w:numId="9" w16cid:durableId="1886746089">
-    <w:abstractNumId w:val="37"/>
+    <w:abstractNumId w:val="44"/>
   </w:num>
   <w:num w:numId="10" w16cid:durableId="650066308">
-    <w:abstractNumId w:val="26"/>
+    <w:abstractNumId w:val="31"/>
   </w:num>
   <w:num w:numId="11" w16cid:durableId="266819064">
-    <w:abstractNumId w:val="38"/>
+    <w:abstractNumId w:val="47"/>
   </w:num>
   <w:num w:numId="12" w16cid:durableId="2036731178">
-    <w:abstractNumId w:val="14"/>
+    <w:abstractNumId w:val="15"/>
   </w:num>
   <w:num w:numId="13" w16cid:durableId="902059320">
     <w:abstractNumId w:val="8"/>
   </w:num>
   <w:num w:numId="14" w16cid:durableId="1487697065">
-    <w:abstractNumId w:val="22"/>
+    <w:abstractNumId w:val="27"/>
   </w:num>
   <w:num w:numId="15" w16cid:durableId="1562982151">
     <w:abstractNumId w:val="1"/>
   </w:num>
   <w:num w:numId="16" w16cid:durableId="200630349">
-    <w:abstractNumId w:val="13"/>
+    <w:abstractNumId w:val="14"/>
   </w:num>
   <w:num w:numId="17" w16cid:durableId="1619027387">
     <w:abstractNumId w:val="11"/>
   </w:num>
   <w:num w:numId="18" w16cid:durableId="1697152611">
-    <w:abstractNumId w:val="32"/>
+    <w:abstractNumId w:val="38"/>
   </w:num>
   <w:num w:numId="19" w16cid:durableId="1036738356">
-    <w:abstractNumId w:val="20"/>
+    <w:abstractNumId w:val="22"/>
   </w:num>
   <w:num w:numId="20" w16cid:durableId="1328509842">
-    <w:abstractNumId w:val="39"/>
+    <w:abstractNumId w:val="48"/>
   </w:num>
   <w:num w:numId="21" w16cid:durableId="1916014568">
     <w:abstractNumId w:val="10"/>
   </w:num>
   <w:num w:numId="22" w16cid:durableId="1447236432">
-    <w:abstractNumId w:val="30"/>
+    <w:abstractNumId w:val="36"/>
   </w:num>
   <w:num w:numId="23" w16cid:durableId="2056851643">
-    <w:abstractNumId w:val="19"/>
+    <w:abstractNumId w:val="21"/>
   </w:num>
   <w:num w:numId="24" w16cid:durableId="1478690699">
-    <w:abstractNumId w:val="40"/>
+    <w:abstractNumId w:val="49"/>
   </w:num>
   <w:num w:numId="25" w16cid:durableId="1512641807">
     <w:abstractNumId w:val="5"/>
   </w:num>
   <w:num w:numId="26" w16cid:durableId="954480404">
-    <w:abstractNumId w:val="25"/>
+    <w:abstractNumId w:val="30"/>
   </w:num>
   <w:num w:numId="27" w16cid:durableId="1430852547">
     <w:abstractNumId w:val="6"/>
   </w:num>
   <w:num w:numId="28" w16cid:durableId="876813661">
-    <w:abstractNumId w:val="29"/>
+    <w:abstractNumId w:val="34"/>
   </w:num>
   <w:num w:numId="29" w16cid:durableId="632637685">
-    <w:abstractNumId w:val="12"/>
+    <w:abstractNumId w:val="13"/>
   </w:num>
   <w:num w:numId="30" w16cid:durableId="1710690097">
-    <w:abstractNumId w:val="21"/>
+    <w:abstractNumId w:val="24"/>
   </w:num>
   <w:num w:numId="31" w16cid:durableId="1677802237">
     <w:abstractNumId w:val="0"/>
   </w:num>
   <w:num w:numId="32" w16cid:durableId="1751582639">
-    <w:abstractNumId w:val="15"/>
+    <w:abstractNumId w:val="16"/>
   </w:num>
   <w:num w:numId="33" w16cid:durableId="1398019252">
-    <w:abstractNumId w:val="31"/>
+    <w:abstractNumId w:val="37"/>
   </w:num>
   <w:num w:numId="34" w16cid:durableId="1332682007">
-    <w:abstractNumId w:val="34"/>
+    <w:abstractNumId w:val="40"/>
   </w:num>
   <w:num w:numId="35" w16cid:durableId="1288775644">
-    <w:abstractNumId w:val="16"/>
+    <w:abstractNumId w:val="18"/>
   </w:num>
   <w:num w:numId="36" w16cid:durableId="1114058048">
-    <w:abstractNumId w:val="33"/>
+    <w:abstractNumId w:val="39"/>
   </w:num>
   <w:num w:numId="37" w16cid:durableId="39941009">
     <w:abstractNumId w:val="7"/>
   </w:num>
   <w:num w:numId="38" w16cid:durableId="1529369227">
-    <w:abstractNumId w:val="18"/>
+    <w:abstractNumId w:val="20"/>
   </w:num>
   <w:num w:numId="39" w16cid:durableId="875043313">
-    <w:abstractNumId w:val="36"/>
+    <w:abstractNumId w:val="43"/>
   </w:num>
   <w:num w:numId="40" w16cid:durableId="433672096">
     <w:abstractNumId w:val="4"/>
   </w:num>
   <w:num w:numId="41" w16cid:durableId="1817843198">
+    <w:abstractNumId w:val="42"/>
+  </w:num>
+  <w:num w:numId="42" w16cid:durableId="66660169">
+    <w:abstractNumId w:val="17"/>
+  </w:num>
+  <w:num w:numId="43" w16cid:durableId="2060126847">
+    <w:abstractNumId w:val="12"/>
+  </w:num>
+  <w:num w:numId="44" w16cid:durableId="338586820">
+    <w:abstractNumId w:val="41"/>
+  </w:num>
+  <w:num w:numId="45" w16cid:durableId="889224766">
     <w:abstractNumId w:val="35"/>
+  </w:num>
+  <w:num w:numId="46" w16cid:durableId="1290934915">
+    <w:abstractNumId w:val="25"/>
+  </w:num>
+  <w:num w:numId="47" w16cid:durableId="210045384">
+    <w:abstractNumId w:val="26"/>
+  </w:num>
+  <w:num w:numId="48" w16cid:durableId="198398213">
+    <w:abstractNumId w:val="46"/>
+  </w:num>
+  <w:num w:numId="49" w16cid:durableId="1092508899">
+    <w:abstractNumId w:val="45"/>
+  </w:num>
+  <w:num w:numId="50" w16cid:durableId="1006789313">
+    <w:abstractNumId w:val="23"/>
   </w:num>
 </w:numbering>
 </file>

</xml_diff>

<commit_message>
Added some content about dictionaries
</commit_message>
<xml_diff>
--- a/python.docx
+++ b/python.docx
@@ -40887,12 +40887,18 @@
         <w:rPr>
           <w:b/>
           <w:bCs/>
-        </w:rPr>
-      </w:pPr>
-      <w:r>
-        <w:rPr>
-          <w:b/>
-          <w:bCs/>
+          <w:sz w:val="28"/>
+          <w:szCs w:val="28"/>
+          <w:u w:val="single"/>
+        </w:rPr>
+      </w:pPr>
+      <w:r>
+        <w:rPr>
+          <w:b/>
+          <w:bCs/>
+          <w:sz w:val="44"/>
+          <w:szCs w:val="44"/>
+          <w:u w:val="single"/>
         </w:rPr>
         <w:t>Dictionary Merging</w:t>
       </w:r>
@@ -40909,11 +40915,6 @@
       <w:pPr>
         <w:pStyle w:val="NoSpacing"/>
       </w:pPr>
-      <w:r>
-        <w:pict w14:anchorId="5C615A04">
-          <v:rect id="_x0000_i1050" style="width:566.05pt;height:1.5pt" o:hrpct="0" o:hrstd="t" o:hr="t" fillcolor="#a0a0a0" stroked="f"/>
-        </w:pict>
-      </w:r>
     </w:p>
     <w:p>
       <w:pPr>
@@ -40939,6 +40940,7 @@
         <w:rPr>
           <w:b/>
           <w:bCs/>
+          <w:highlight w:val="green"/>
         </w:rPr>
         <w:t>Method 1: Using the </w:t>
       </w:r>
@@ -40947,6 +40949,7 @@
         <w:rPr>
           <w:b/>
           <w:bCs/>
+          <w:highlight w:val="green"/>
         </w:rPr>
         <w:t>update(</w:t>
       </w:r>
@@ -40955,6 +40958,7 @@
         <w:rPr>
           <w:b/>
           <w:bCs/>
+          <w:highlight w:val="green"/>
         </w:rPr>
         <w:t>) Method (Modifies Original Dictionary)</w:t>
       </w:r>
@@ -40997,14 +41001,24 @@
         <w:pStyle w:val="NoSpacing"/>
       </w:pPr>
       <w:r>
+        <w:rPr>
+          <w:highlight w:val="yellow"/>
+        </w:rPr>
+        <w:lastRenderedPageBreak/>
         <w:t>dict1.update(dict2</w:t>
       </w:r>
       <w:proofErr w:type="gramStart"/>
       <w:r>
+        <w:rPr>
+          <w:highlight w:val="yellow"/>
+        </w:rPr>
         <w:t>)  #</w:t>
       </w:r>
       <w:proofErr w:type="gramEnd"/>
       <w:r>
+        <w:rPr>
+          <w:highlight w:val="yellow"/>
+        </w:rPr>
         <w:t xml:space="preserve"> Merging dict2 into dict1</w:t>
       </w:r>
     </w:p>
@@ -41013,7 +41027,6 @@
         <w:pStyle w:val="NoSpacing"/>
       </w:pPr>
       <w:r>
-        <w:lastRenderedPageBreak/>
         <w:t xml:space="preserve">print(dict1)  </w:t>
       </w:r>
     </w:p>
@@ -41037,20 +41050,16 @@
       <w:pPr>
         <w:pStyle w:val="NoSpacing"/>
       </w:pPr>
-      <w:r>
-        <w:pict w14:anchorId="1DC737F4">
-          <v:rect id="_x0000_i1051" style="width:566.05pt;height:1.5pt" o:hrpct="0" o:hrstd="t" o:hr="t" fillcolor="#a0a0a0" stroked="f"/>
-        </w:pict>
-      </w:r>
-    </w:p>
-    <w:p>
-      <w:pPr>
-        <w:pStyle w:val="NoSpacing"/>
-      </w:pPr>
-      <w:r>
-        <w:rPr>
-          <w:b/>
-          <w:bCs/>
+    </w:p>
+    <w:p>
+      <w:pPr>
+        <w:pStyle w:val="NoSpacing"/>
+      </w:pPr>
+      <w:r>
+        <w:rPr>
+          <w:b/>
+          <w:bCs/>
+          <w:highlight w:val="green"/>
         </w:rPr>
         <w:t>Method 2: Using the | Operator (Python 3.9+) (Creates New Dictionary)</w:t>
       </w:r>
@@ -41086,18 +41095,30 @@
       </w:pPr>
       <w:proofErr w:type="spellStart"/>
       <w:r>
+        <w:rPr>
+          <w:highlight w:val="yellow"/>
+        </w:rPr>
         <w:t>merged_dict</w:t>
       </w:r>
       <w:proofErr w:type="spellEnd"/>
       <w:r>
+        <w:rPr>
+          <w:highlight w:val="yellow"/>
+        </w:rPr>
         <w:t xml:space="preserve"> = dict1 | dict</w:t>
       </w:r>
       <w:proofErr w:type="gramStart"/>
       <w:r>
+        <w:rPr>
+          <w:highlight w:val="yellow"/>
+        </w:rPr>
         <w:t>2  #</w:t>
       </w:r>
       <w:proofErr w:type="gramEnd"/>
       <w:r>
+        <w:rPr>
+          <w:highlight w:val="yellow"/>
+        </w:rPr>
         <w:t xml:space="preserve"> Merging into a new dictionary</w:t>
       </w:r>
     </w:p>
@@ -41137,20 +41158,16 @@
       <w:pPr>
         <w:pStyle w:val="NoSpacing"/>
       </w:pPr>
-      <w:r>
-        <w:pict w14:anchorId="7EBA3FB6">
-          <v:rect id="_x0000_i1052" style="width:566.05pt;height:1.5pt" o:hrpct="0" o:hrstd="t" o:hr="t" fillcolor="#a0a0a0" stroked="f"/>
-        </w:pict>
-      </w:r>
-    </w:p>
-    <w:p>
-      <w:pPr>
-        <w:pStyle w:val="NoSpacing"/>
-      </w:pPr>
-      <w:r>
-        <w:rPr>
-          <w:b/>
-          <w:bCs/>
+    </w:p>
+    <w:p>
+      <w:pPr>
+        <w:pStyle w:val="NoSpacing"/>
+      </w:pPr>
+      <w:r>
+        <w:rPr>
+          <w:b/>
+          <w:bCs/>
+          <w:highlight w:val="green"/>
         </w:rPr>
         <w:t>Method 3: Using Dictionary Comprehension (Flexible Custom Merging)</w:t>
       </w:r>
@@ -41186,28 +41203,46 @@
       </w:pPr>
       <w:proofErr w:type="spellStart"/>
       <w:r>
+        <w:rPr>
+          <w:highlight w:val="yellow"/>
+        </w:rPr>
         <w:t>merged_dict</w:t>
       </w:r>
       <w:proofErr w:type="spellEnd"/>
       <w:r>
+        <w:rPr>
+          <w:highlight w:val="yellow"/>
+        </w:rPr>
         <w:t xml:space="preserve"> = {k: v </w:t>
       </w:r>
       <w:proofErr w:type="spellStart"/>
       <w:r>
+        <w:rPr>
+          <w:highlight w:val="yellow"/>
+        </w:rPr>
         <w:t>for d</w:t>
       </w:r>
       <w:proofErr w:type="spellEnd"/>
       <w:r>
+        <w:rPr>
+          <w:highlight w:val="yellow"/>
+        </w:rPr>
         <w:t xml:space="preserve"> in (dict1, dict2) for k, v in </w:t>
       </w:r>
       <w:proofErr w:type="spellStart"/>
       <w:proofErr w:type="gramStart"/>
       <w:r>
+        <w:rPr>
+          <w:highlight w:val="yellow"/>
+        </w:rPr>
         <w:t>d.items</w:t>
       </w:r>
       <w:proofErr w:type="spellEnd"/>
       <w:proofErr w:type="gramEnd"/>
       <w:r>
+        <w:rPr>
+          <w:highlight w:val="yellow"/>
+        </w:rPr>
         <w:t>()}</w:t>
       </w:r>
     </w:p>
@@ -41251,6 +41286,1710 @@
       </w:r>
       <w:r>
         <w:t> are iterated through and merged, with the last occurrence of each key taking precedence.</w:t>
+      </w:r>
+    </w:p>
+    <w:p>
+      <w:pPr>
+        <w:pStyle w:val="NoSpacing"/>
+      </w:pPr>
+    </w:p>
+    <w:p>
+      <w:pPr>
+        <w:pStyle w:val="NoSpacing"/>
+        <w:rPr>
+          <w:b/>
+          <w:bCs/>
+          <w:sz w:val="44"/>
+          <w:szCs w:val="44"/>
+          <w:u w:val="single"/>
+        </w:rPr>
+      </w:pPr>
+      <w:r>
+        <w:rPr>
+          <w:b/>
+          <w:bCs/>
+          <w:sz w:val="44"/>
+          <w:szCs w:val="44"/>
+          <w:u w:val="single"/>
+        </w:rPr>
+        <w:t>Dictionary Transformation</w:t>
+      </w:r>
+    </w:p>
+    <w:p>
+      <w:pPr>
+        <w:pStyle w:val="NoSpacing"/>
+      </w:pPr>
+      <w:r>
+        <w:t>In this lesson, we will dive into </w:t>
+      </w:r>
+      <w:r>
+        <w:rPr>
+          <w:b/>
+          <w:bCs/>
+        </w:rPr>
+        <w:t>Dictionary Transformation</w:t>
+      </w:r>
+      <w:r>
+        <w:t>, a powerful technique for modifying dictionaries to fit different formats or requirements. If you've completed the previous lessons on </w:t>
+      </w:r>
+      <w:r>
+        <w:rPr>
+          <w:b/>
+          <w:bCs/>
+        </w:rPr>
+        <w:t>Dictionary Basics</w:t>
+      </w:r>
+      <w:r>
+        <w:t> and </w:t>
+      </w:r>
+      <w:r>
+        <w:rPr>
+          <w:b/>
+          <w:bCs/>
+        </w:rPr>
+        <w:t>Dictionary Methods</w:t>
+      </w:r>
+      <w:r>
+        <w:t>, this lesson will build on that knowledge and help you manipulate dictionaries efficiently.</w:t>
+      </w:r>
+    </w:p>
+    <w:p>
+      <w:pPr>
+        <w:pStyle w:val="NoSpacing"/>
+      </w:pPr>
+    </w:p>
+    <w:p>
+      <w:pPr>
+        <w:pStyle w:val="NoSpacing"/>
+      </w:pPr>
+      <w:r>
+        <w:rPr>
+          <w:b/>
+          <w:bCs/>
+          <w:highlight w:val="green"/>
+        </w:rPr>
+        <w:t>Reversing Key-Value Pairs</w:t>
+      </w:r>
+      <w:r>
+        <w:br/>
+        <w:t>Sometimes, you may need to swap the keys and values in a dictionary, which is useful when you want to look up keys based on their values.</w:t>
+      </w:r>
+    </w:p>
+    <w:p>
+      <w:pPr>
+        <w:pStyle w:val="NoSpacing"/>
+      </w:pPr>
+      <w:proofErr w:type="spellStart"/>
+      <w:r>
+        <w:t>original_dict</w:t>
+      </w:r>
+      <w:proofErr w:type="spellEnd"/>
+      <w:r>
+        <w:t xml:space="preserve"> = {'a': 1, 'b': 2, 'c': 3}</w:t>
+      </w:r>
+    </w:p>
+    <w:p>
+      <w:pPr>
+        <w:pStyle w:val="NoSpacing"/>
+      </w:pPr>
+      <w:proofErr w:type="spellStart"/>
+      <w:r>
+        <w:rPr>
+          <w:highlight w:val="yellow"/>
+        </w:rPr>
+        <w:t>transformed_dict</w:t>
+      </w:r>
+      <w:proofErr w:type="spellEnd"/>
+      <w:r>
+        <w:rPr>
+          <w:highlight w:val="yellow"/>
+        </w:rPr>
+        <w:t xml:space="preserve"> = {value: key for key, value in </w:t>
+      </w:r>
+      <w:proofErr w:type="spellStart"/>
+      <w:r>
+        <w:rPr>
+          <w:highlight w:val="yellow"/>
+        </w:rPr>
+        <w:t>original_</w:t>
+      </w:r>
+      <w:proofErr w:type="gramStart"/>
+      <w:r>
+        <w:rPr>
+          <w:highlight w:val="yellow"/>
+        </w:rPr>
+        <w:t>dict.items</w:t>
+      </w:r>
+      <w:proofErr w:type="spellEnd"/>
+      <w:proofErr w:type="gramEnd"/>
+      <w:r>
+        <w:rPr>
+          <w:highlight w:val="yellow"/>
+        </w:rPr>
+        <w:t>()}</w:t>
+      </w:r>
+    </w:p>
+    <w:p>
+      <w:pPr>
+        <w:pStyle w:val="NoSpacing"/>
+      </w:pPr>
+      <w:r>
+        <w:t>print(</w:t>
+      </w:r>
+      <w:proofErr w:type="spellStart"/>
+      <w:r>
+        <w:t>transformed_dict</w:t>
+      </w:r>
+      <w:proofErr w:type="spellEnd"/>
+      <w:r>
+        <w:t xml:space="preserve">)  </w:t>
+      </w:r>
+    </w:p>
+    <w:p>
+      <w:pPr>
+        <w:pStyle w:val="NoSpacing"/>
+      </w:pPr>
+      <w:r>
+        <w:t># Output: {1: 'a', 2: 'b', 3: 'c'}</w:t>
+      </w:r>
+    </w:p>
+    <w:p>
+      <w:pPr>
+        <w:pStyle w:val="NoSpacing"/>
+      </w:pPr>
+    </w:p>
+    <w:p>
+      <w:pPr>
+        <w:pStyle w:val="NoSpacing"/>
+      </w:pPr>
+      <w:r>
+        <w:rPr>
+          <w:b/>
+          <w:bCs/>
+          <w:highlight w:val="green"/>
+        </w:rPr>
+        <w:t>Applying Functions to Values</w:t>
+      </w:r>
+      <w:r>
+        <w:br/>
+        <w:t>You can transform dictionary values using a function. For example, if you have a dictionary of grades and want to increase each grade by 5 points:</w:t>
+      </w:r>
+    </w:p>
+    <w:p>
+      <w:pPr>
+        <w:pStyle w:val="NoSpacing"/>
+      </w:pPr>
+      <w:r>
+        <w:t>grades = {'Alice': 85, 'Bob': 90, 'Charlie': 88}</w:t>
+      </w:r>
+    </w:p>
+    <w:p>
+      <w:pPr>
+        <w:pStyle w:val="NoSpacing"/>
+      </w:pPr>
+      <w:proofErr w:type="spellStart"/>
+      <w:r>
+        <w:rPr>
+          <w:highlight w:val="yellow"/>
+        </w:rPr>
+        <w:lastRenderedPageBreak/>
+        <w:t>updated_grades</w:t>
+      </w:r>
+      <w:proofErr w:type="spellEnd"/>
+      <w:r>
+        <w:rPr>
+          <w:highlight w:val="yellow"/>
+        </w:rPr>
+        <w:t xml:space="preserve"> = {student: grade + 5 for student, grade in </w:t>
+      </w:r>
+      <w:proofErr w:type="spellStart"/>
+      <w:proofErr w:type="gramStart"/>
+      <w:r>
+        <w:rPr>
+          <w:highlight w:val="yellow"/>
+        </w:rPr>
+        <w:t>grades.items</w:t>
+      </w:r>
+      <w:proofErr w:type="spellEnd"/>
+      <w:proofErr w:type="gramEnd"/>
+      <w:r>
+        <w:rPr>
+          <w:highlight w:val="yellow"/>
+        </w:rPr>
+        <w:t>()}</w:t>
+      </w:r>
+    </w:p>
+    <w:p>
+      <w:pPr>
+        <w:pStyle w:val="NoSpacing"/>
+      </w:pPr>
+      <w:r>
+        <w:t>print(</w:t>
+      </w:r>
+      <w:proofErr w:type="spellStart"/>
+      <w:r>
+        <w:t>updated_grades</w:t>
+      </w:r>
+      <w:proofErr w:type="spellEnd"/>
+      <w:r>
+        <w:t xml:space="preserve">)  </w:t>
+      </w:r>
+    </w:p>
+    <w:p>
+      <w:pPr>
+        <w:pStyle w:val="NoSpacing"/>
+      </w:pPr>
+      <w:r>
+        <w:t># Output: {'Alice': 90, 'Bob': 95, 'Charlie': 93}</w:t>
+      </w:r>
+    </w:p>
+    <w:p>
+      <w:pPr>
+        <w:pStyle w:val="NoSpacing"/>
+      </w:pPr>
+      <w:r>
+        <w:t>This technique is especially useful when applying mathematical operations, conversions, or formatting values.</w:t>
+      </w:r>
+    </w:p>
+    <w:p>
+      <w:pPr>
+        <w:pStyle w:val="NoSpacing"/>
+      </w:pPr>
+    </w:p>
+    <w:p>
+      <w:pPr>
+        <w:pStyle w:val="NoSpacing"/>
+      </w:pPr>
+      <w:r>
+        <w:rPr>
+          <w:b/>
+          <w:bCs/>
+          <w:highlight w:val="green"/>
+        </w:rPr>
+        <w:t>Filtering Dictionary Items</w:t>
+      </w:r>
+      <w:r>
+        <w:br/>
+        <w:t>You can create </w:t>
+      </w:r>
+      <w:r>
+        <w:rPr>
+          <w:b/>
+          <w:bCs/>
+        </w:rPr>
+        <w:t>a new dictionary</w:t>
+      </w:r>
+      <w:r>
+        <w:t> containing only items that meet a certain condition. For example, let’s filter out students who scored </w:t>
+      </w:r>
+      <w:r>
+        <w:rPr>
+          <w:b/>
+          <w:bCs/>
+        </w:rPr>
+        <w:t>above 85</w:t>
+      </w:r>
+      <w:r>
+        <w:t>:</w:t>
+      </w:r>
+    </w:p>
+    <w:p>
+      <w:pPr>
+        <w:pStyle w:val="NoSpacing"/>
+      </w:pPr>
+      <w:proofErr w:type="spellStart"/>
+      <w:r>
+        <w:rPr>
+          <w:highlight w:val="yellow"/>
+        </w:rPr>
+        <w:t>filtered_grades</w:t>
+      </w:r>
+      <w:proofErr w:type="spellEnd"/>
+      <w:r>
+        <w:rPr>
+          <w:highlight w:val="yellow"/>
+        </w:rPr>
+        <w:t xml:space="preserve"> = {student: grade for student, grade in </w:t>
+      </w:r>
+      <w:proofErr w:type="spellStart"/>
+      <w:proofErr w:type="gramStart"/>
+      <w:r>
+        <w:rPr>
+          <w:highlight w:val="yellow"/>
+        </w:rPr>
+        <w:t>grades.items</w:t>
+      </w:r>
+      <w:proofErr w:type="spellEnd"/>
+      <w:proofErr w:type="gramEnd"/>
+      <w:r>
+        <w:rPr>
+          <w:highlight w:val="yellow"/>
+        </w:rPr>
+        <w:t>() if grade &gt; 85}</w:t>
+      </w:r>
+    </w:p>
+    <w:p>
+      <w:pPr>
+        <w:pStyle w:val="NoSpacing"/>
+      </w:pPr>
+      <w:r>
+        <w:t>print(</w:t>
+      </w:r>
+      <w:proofErr w:type="spellStart"/>
+      <w:r>
+        <w:t>filtered_grades</w:t>
+      </w:r>
+      <w:proofErr w:type="spellEnd"/>
+      <w:r>
+        <w:t xml:space="preserve">)  </w:t>
+      </w:r>
+    </w:p>
+    <w:p>
+      <w:pPr>
+        <w:pStyle w:val="NoSpacing"/>
+      </w:pPr>
+      <w:r>
+        <w:t># Output: {'Bob': 90, 'Charlie': 88}</w:t>
+      </w:r>
+    </w:p>
+    <w:p>
+      <w:pPr>
+        <w:pStyle w:val="NoSpacing"/>
+      </w:pPr>
+      <w:r>
+        <w:t>This approach is helpful for </w:t>
+      </w:r>
+      <w:r>
+        <w:rPr>
+          <w:b/>
+          <w:bCs/>
+        </w:rPr>
+        <w:t>data cleaning</w:t>
+      </w:r>
+      <w:r>
+        <w:t> and </w:t>
+      </w:r>
+      <w:r>
+        <w:rPr>
+          <w:b/>
+          <w:bCs/>
+        </w:rPr>
+        <w:t>selecting relevant</w:t>
+      </w:r>
+      <w:r>
+        <w:t> information from a dataset</w:t>
+      </w:r>
+    </w:p>
+    <w:p>
+      <w:pPr>
+        <w:pStyle w:val="NoSpacing"/>
+      </w:pPr>
+    </w:p>
+    <w:p>
+      <w:pPr>
+        <w:pStyle w:val="NoSpacing"/>
+        <w:rPr>
+          <w:b/>
+          <w:bCs/>
+          <w:sz w:val="44"/>
+          <w:szCs w:val="44"/>
+          <w:u w:val="single"/>
+        </w:rPr>
+      </w:pPr>
+      <w:r>
+        <w:rPr>
+          <w:b/>
+          <w:bCs/>
+          <w:sz w:val="44"/>
+          <w:szCs w:val="44"/>
+          <w:u w:val="single"/>
+        </w:rPr>
+        <w:t>Default Dictionary Usage</w:t>
+      </w:r>
+    </w:p>
+    <w:p>
+      <w:pPr>
+        <w:pStyle w:val="NoSpacing"/>
+      </w:pPr>
+      <w:r>
+        <w:t xml:space="preserve">In this lesson, we’ll </w:t>
+      </w:r>
+      <w:r>
+        <w:rPr>
+          <w:highlight w:val="yellow"/>
+        </w:rPr>
+        <w:t xml:space="preserve">explore </w:t>
+      </w:r>
+      <w:proofErr w:type="spellStart"/>
+      <w:r>
+        <w:rPr>
+          <w:highlight w:val="yellow"/>
+        </w:rPr>
+        <w:t>defaultdict</w:t>
+      </w:r>
+      <w:proofErr w:type="spellEnd"/>
+      <w:r>
+        <w:rPr>
+          <w:highlight w:val="yellow"/>
+        </w:rPr>
+        <w:t xml:space="preserve"> from the </w:t>
+      </w:r>
+      <w:proofErr w:type="gramStart"/>
+      <w:r>
+        <w:rPr>
+          <w:highlight w:val="yellow"/>
+        </w:rPr>
+        <w:t>collections</w:t>
+      </w:r>
+      <w:proofErr w:type="gramEnd"/>
+      <w:r>
+        <w:rPr>
+          <w:highlight w:val="yellow"/>
+        </w:rPr>
+        <w:t xml:space="preserve"> module</w:t>
+      </w:r>
+      <w:r>
+        <w:t xml:space="preserve">—a powerful tool that simplifies dictionary handling in Python. Unlike a regular dictionary, </w:t>
+      </w:r>
+      <w:r>
+        <w:rPr>
+          <w:highlight w:val="yellow"/>
+        </w:rPr>
+        <w:t xml:space="preserve">a </w:t>
+      </w:r>
+      <w:proofErr w:type="spellStart"/>
+      <w:r>
+        <w:rPr>
+          <w:highlight w:val="yellow"/>
+        </w:rPr>
+        <w:t>defaultdict</w:t>
+      </w:r>
+      <w:proofErr w:type="spellEnd"/>
+      <w:r>
+        <w:rPr>
+          <w:highlight w:val="yellow"/>
+        </w:rPr>
+        <w:t xml:space="preserve"> automatically assigns a default value to a key if it doesn’t exist yet. This helps prevent errors, reduces redundant code, and enhances efficiency.</w:t>
+      </w:r>
+    </w:p>
+    <w:p>
+      <w:pPr>
+        <w:pStyle w:val="NoSpacing"/>
+      </w:pPr>
+    </w:p>
+    <w:p>
+      <w:pPr>
+        <w:pStyle w:val="NoSpacing"/>
+      </w:pPr>
+      <w:r>
+        <w:rPr>
+          <w:b/>
+          <w:bCs/>
+          <w:highlight w:val="green"/>
+        </w:rPr>
+        <w:t>Example: Regular Dictionary vs. </w:t>
+      </w:r>
+      <w:proofErr w:type="spellStart"/>
+      <w:r>
+        <w:rPr>
+          <w:b/>
+          <w:bCs/>
+          <w:highlight w:val="green"/>
+        </w:rPr>
+        <w:t>defaultdict</w:t>
+      </w:r>
+      <w:proofErr w:type="spellEnd"/>
+    </w:p>
+    <w:p>
+      <w:pPr>
+        <w:pStyle w:val="NoSpacing"/>
+      </w:pPr>
+      <w:r>
+        <w:t># Using a regular dictionary</w:t>
+      </w:r>
+    </w:p>
+    <w:p>
+      <w:pPr>
+        <w:pStyle w:val="NoSpacing"/>
+      </w:pPr>
+      <w:proofErr w:type="spellStart"/>
+      <w:r>
+        <w:t>my_dict</w:t>
+      </w:r>
+      <w:proofErr w:type="spellEnd"/>
+      <w:r>
+        <w:t xml:space="preserve"> = {}</w:t>
+      </w:r>
+    </w:p>
+    <w:p>
+      <w:pPr>
+        <w:pStyle w:val="NoSpacing"/>
+      </w:pPr>
+      <w:r>
+        <w:rPr>
+          <w:highlight w:val="yellow"/>
+        </w:rPr>
+        <w:t>print(</w:t>
+      </w:r>
+      <w:proofErr w:type="spellStart"/>
+      <w:r>
+        <w:rPr>
+          <w:highlight w:val="yellow"/>
+        </w:rPr>
+        <w:t>my_dict</w:t>
+      </w:r>
+      <w:proofErr w:type="spellEnd"/>
+      <w:r>
+        <w:rPr>
+          <w:highlight w:val="yellow"/>
+        </w:rPr>
+        <w:t>['apple'</w:t>
+      </w:r>
+      <w:proofErr w:type="gramStart"/>
+      <w:r>
+        <w:rPr>
+          <w:highlight w:val="yellow"/>
+        </w:rPr>
+        <w:t>])  #</w:t>
+      </w:r>
+      <w:proofErr w:type="gramEnd"/>
+      <w:r>
+        <w:rPr>
+          <w:highlight w:val="yellow"/>
+        </w:rPr>
+        <w:t xml:space="preserve"> Raises </w:t>
+      </w:r>
+      <w:proofErr w:type="spellStart"/>
+      <w:r>
+        <w:rPr>
+          <w:highlight w:val="yellow"/>
+        </w:rPr>
+        <w:t>KeyError</w:t>
+      </w:r>
+      <w:proofErr w:type="spellEnd"/>
+      <w:r>
+        <w:rPr>
+          <w:highlight w:val="yellow"/>
+        </w:rPr>
+        <w:t>: 'apple'</w:t>
+      </w:r>
+      <w:r>
+        <w:t xml:space="preserve">  </w:t>
+      </w:r>
+    </w:p>
+    <w:p>
+      <w:pPr>
+        <w:pStyle w:val="NoSpacing"/>
+      </w:pPr>
+      <w:r>
+        <w:t xml:space="preserve"># Using </w:t>
+      </w:r>
+      <w:proofErr w:type="spellStart"/>
+      <w:r>
+        <w:t>defaultdict</w:t>
+      </w:r>
+      <w:proofErr w:type="spellEnd"/>
+      <w:r>
+        <w:t xml:space="preserve"> to avoid </w:t>
+      </w:r>
+      <w:proofErr w:type="spellStart"/>
+      <w:r>
+        <w:t>KeyError</w:t>
+      </w:r>
+      <w:proofErr w:type="spellEnd"/>
+    </w:p>
+    <w:p>
+      <w:pPr>
+        <w:pStyle w:val="NoSpacing"/>
+      </w:pPr>
+      <w:r>
+        <w:t xml:space="preserve">from collections import </w:t>
+      </w:r>
+      <w:proofErr w:type="spellStart"/>
+      <w:r>
+        <w:t>defaultdict</w:t>
+      </w:r>
+      <w:proofErr w:type="spellEnd"/>
+    </w:p>
+    <w:p>
+      <w:pPr>
+        <w:pStyle w:val="NoSpacing"/>
+      </w:pPr>
+    </w:p>
+    <w:p>
+      <w:pPr>
+        <w:pStyle w:val="NoSpacing"/>
+        <w:rPr>
+          <w:highlight w:val="yellow"/>
+        </w:rPr>
+      </w:pPr>
+      <w:proofErr w:type="spellStart"/>
+      <w:r>
+        <w:rPr>
+          <w:highlight w:val="yellow"/>
+        </w:rPr>
+        <w:t>my_dict</w:t>
+      </w:r>
+      <w:proofErr w:type="spellEnd"/>
+      <w:r>
+        <w:rPr>
+          <w:highlight w:val="yellow"/>
+        </w:rPr>
+        <w:t xml:space="preserve"> = </w:t>
+      </w:r>
+      <w:proofErr w:type="spellStart"/>
+      <w:r>
+        <w:rPr>
+          <w:highlight w:val="yellow"/>
+        </w:rPr>
+        <w:t>defaultdict</w:t>
+      </w:r>
+      <w:proofErr w:type="spellEnd"/>
+      <w:r>
+        <w:rPr>
+          <w:highlight w:val="yellow"/>
+        </w:rPr>
+        <w:t>(int)</w:t>
+      </w:r>
+    </w:p>
+    <w:p>
+      <w:pPr>
+        <w:pStyle w:val="NoSpacing"/>
+      </w:pPr>
+      <w:r>
+        <w:rPr>
+          <w:highlight w:val="yellow"/>
+        </w:rPr>
+        <w:t>print(</w:t>
+      </w:r>
+      <w:proofErr w:type="spellStart"/>
+      <w:r>
+        <w:rPr>
+          <w:highlight w:val="yellow"/>
+        </w:rPr>
+        <w:t>my_dict</w:t>
+      </w:r>
+      <w:proofErr w:type="spellEnd"/>
+      <w:r>
+        <w:rPr>
+          <w:highlight w:val="yellow"/>
+        </w:rPr>
+        <w:t>['apple'</w:t>
+      </w:r>
+      <w:proofErr w:type="gramStart"/>
+      <w:r>
+        <w:rPr>
+          <w:highlight w:val="yellow"/>
+        </w:rPr>
+        <w:t>])  #</w:t>
+      </w:r>
+      <w:proofErr w:type="gramEnd"/>
+      <w:r>
+        <w:rPr>
+          <w:highlight w:val="yellow"/>
+        </w:rPr>
+        <w:t xml:space="preserve"> Outputs: 0</w:t>
+      </w:r>
+    </w:p>
+    <w:p>
+      <w:pPr>
+        <w:pStyle w:val="NoSpacing"/>
+      </w:pPr>
+      <w:r>
+        <w:t xml:space="preserve">Here, </w:t>
+      </w:r>
+      <w:proofErr w:type="spellStart"/>
+      <w:r>
+        <w:t>defaultdict</w:t>
+      </w:r>
+      <w:proofErr w:type="spellEnd"/>
+      <w:r>
+        <w:t>(int) initializes missing keys with 0 because the default type is int. Instead of raising an error, it seamlessly handles missing keys.</w:t>
+      </w:r>
+    </w:p>
+    <w:p>
+      <w:pPr>
+        <w:pStyle w:val="NoSpacing"/>
+      </w:pPr>
+    </w:p>
+    <w:p>
+      <w:pPr>
+        <w:pStyle w:val="NoSpacing"/>
+        <w:rPr>
+          <w:b/>
+          <w:bCs/>
+        </w:rPr>
+      </w:pPr>
+      <w:r>
+        <w:rPr>
+          <w:b/>
+          <w:bCs/>
+          <w:highlight w:val="green"/>
+        </w:rPr>
+        <w:t xml:space="preserve">Using </w:t>
+      </w:r>
+      <w:proofErr w:type="spellStart"/>
+      <w:r>
+        <w:rPr>
+          <w:b/>
+          <w:bCs/>
+          <w:highlight w:val="green"/>
+        </w:rPr>
+        <w:t>defaultdict</w:t>
+      </w:r>
+      <w:proofErr w:type="spellEnd"/>
+      <w:r>
+        <w:rPr>
+          <w:b/>
+          <w:bCs/>
+          <w:highlight w:val="green"/>
+        </w:rPr>
+        <w:t xml:space="preserve"> for Different Data Types</w:t>
+      </w:r>
+    </w:p>
+    <w:p>
+      <w:pPr>
+        <w:pStyle w:val="NoSpacing"/>
+      </w:pPr>
+      <w:r>
+        <w:t>The beauty of </w:t>
+      </w:r>
+      <w:proofErr w:type="spellStart"/>
+      <w:r>
+        <w:t>defaultdict</w:t>
+      </w:r>
+      <w:proofErr w:type="spellEnd"/>
+      <w:r>
+        <w:t> lies in its flexibility. You can specify various default types such as list, set, or even custom functions.</w:t>
+      </w:r>
+    </w:p>
+    <w:p>
+      <w:pPr>
+        <w:pStyle w:val="NoSpacing"/>
+      </w:pPr>
+      <w:r>
+        <w:rPr>
+          <w:b/>
+          <w:bCs/>
+        </w:rPr>
+        <w:t>1</w:t>
+      </w:r>
+      <w:r>
+        <w:rPr>
+          <w:b/>
+          <w:bCs/>
+          <w:highlight w:val="green"/>
+        </w:rPr>
+        <w:t>. Grouping Items with list</w:t>
+      </w:r>
+      <w:r>
+        <w:br/>
+        <w:t>A </w:t>
+      </w:r>
+      <w:proofErr w:type="spellStart"/>
+      <w:r>
+        <w:t>defaultdict</w:t>
+      </w:r>
+      <w:proofErr w:type="spellEnd"/>
+      <w:r>
+        <w:t>(list) is useful when storing multiple values under a single key, such as categorizing fruits.</w:t>
+      </w:r>
+    </w:p>
+    <w:p>
+      <w:pPr>
+        <w:pStyle w:val="NoSpacing"/>
+      </w:pPr>
+      <w:r>
+        <w:rPr>
+          <w:highlight w:val="yellow"/>
+        </w:rPr>
+        <w:t xml:space="preserve">from collections import </w:t>
+      </w:r>
+      <w:proofErr w:type="spellStart"/>
+      <w:r>
+        <w:rPr>
+          <w:highlight w:val="yellow"/>
+        </w:rPr>
+        <w:t>defaultdict</w:t>
+      </w:r>
+      <w:proofErr w:type="spellEnd"/>
+    </w:p>
+    <w:p>
+      <w:pPr>
+        <w:pStyle w:val="NoSpacing"/>
+      </w:pPr>
+    </w:p>
+    <w:p>
+      <w:pPr>
+        <w:pStyle w:val="NoSpacing"/>
+      </w:pPr>
+      <w:r>
+        <w:rPr>
+          <w:highlight w:val="yellow"/>
+        </w:rPr>
+        <w:t xml:space="preserve">fruits = </w:t>
+      </w:r>
+      <w:proofErr w:type="spellStart"/>
+      <w:r>
+        <w:rPr>
+          <w:highlight w:val="yellow"/>
+        </w:rPr>
+        <w:t>defaultdict</w:t>
+      </w:r>
+      <w:proofErr w:type="spellEnd"/>
+      <w:r>
+        <w:rPr>
+          <w:highlight w:val="yellow"/>
+        </w:rPr>
+        <w:t>(list)</w:t>
+      </w:r>
+    </w:p>
+    <w:p>
+      <w:pPr>
+        <w:pStyle w:val="NoSpacing"/>
+      </w:pPr>
+    </w:p>
+    <w:p>
+      <w:pPr>
+        <w:pStyle w:val="NoSpacing"/>
+      </w:pPr>
+      <w:r>
+        <w:t>fruits['citrus'</w:t>
+      </w:r>
+      <w:proofErr w:type="gramStart"/>
+      <w:r>
+        <w:t>].append</w:t>
+      </w:r>
+      <w:proofErr w:type="gramEnd"/>
+      <w:r>
+        <w:t>('orange')</w:t>
+      </w:r>
+    </w:p>
+    <w:p>
+      <w:pPr>
+        <w:pStyle w:val="NoSpacing"/>
+      </w:pPr>
+      <w:r>
+        <w:t>fruits['citrus'</w:t>
+      </w:r>
+      <w:proofErr w:type="gramStart"/>
+      <w:r>
+        <w:t>].append</w:t>
+      </w:r>
+      <w:proofErr w:type="gramEnd"/>
+      <w:r>
+        <w:t>('lemon')</w:t>
+      </w:r>
+    </w:p>
+    <w:p>
+      <w:pPr>
+        <w:pStyle w:val="NoSpacing"/>
+      </w:pPr>
+      <w:r>
+        <w:t>fruits['berry'</w:t>
+      </w:r>
+      <w:proofErr w:type="gramStart"/>
+      <w:r>
+        <w:t>].append</w:t>
+      </w:r>
+      <w:proofErr w:type="gramEnd"/>
+      <w:r>
+        <w:t>('strawberry')</w:t>
+      </w:r>
+    </w:p>
+    <w:p>
+      <w:pPr>
+        <w:pStyle w:val="NoSpacing"/>
+      </w:pPr>
+    </w:p>
+    <w:p>
+      <w:pPr>
+        <w:pStyle w:val="NoSpacing"/>
+      </w:pPr>
+      <w:r>
+        <w:lastRenderedPageBreak/>
+        <w:t xml:space="preserve">print(fruits)  </w:t>
+      </w:r>
+    </w:p>
+    <w:p>
+      <w:pPr>
+        <w:pStyle w:val="NoSpacing"/>
+      </w:pPr>
+      <w:r>
+        <w:t># Output: {'citrus': ['orange', 'lemon'], 'berry': ['strawberry']}</w:t>
+      </w:r>
+    </w:p>
+    <w:p>
+      <w:pPr>
+        <w:pStyle w:val="NoSpacing"/>
+      </w:pPr>
+      <w:r>
+        <w:t>Here, </w:t>
+      </w:r>
+      <w:proofErr w:type="spellStart"/>
+      <w:r>
+        <w:t>defaultdict</w:t>
+      </w:r>
+      <w:proofErr w:type="spellEnd"/>
+      <w:r>
+        <w:t xml:space="preserve">(list) automatically initializes an empty list when a new key is accessed, allowing </w:t>
+      </w:r>
+      <w:proofErr w:type="gramStart"/>
+      <w:r>
+        <w:t>direct .append</w:t>
+      </w:r>
+      <w:proofErr w:type="gramEnd"/>
+      <w:r>
+        <w:t>() operations without prior key existence checks.</w:t>
+      </w:r>
+    </w:p>
+    <w:p>
+      <w:pPr>
+        <w:pStyle w:val="NoSpacing"/>
+      </w:pPr>
+    </w:p>
+    <w:p>
+      <w:pPr>
+        <w:pStyle w:val="NoSpacing"/>
+      </w:pPr>
+      <w:r>
+        <w:rPr>
+          <w:b/>
+          <w:bCs/>
+        </w:rPr>
+        <w:t>2</w:t>
+      </w:r>
+      <w:r>
+        <w:rPr>
+          <w:b/>
+          <w:bCs/>
+          <w:highlight w:val="green"/>
+        </w:rPr>
+        <w:t>. Counting with int</w:t>
+      </w:r>
+      <w:r>
+        <w:br/>
+        <w:t>A </w:t>
+      </w:r>
+      <w:proofErr w:type="spellStart"/>
+      <w:r>
+        <w:t>defaultdict</w:t>
+      </w:r>
+      <w:proofErr w:type="spellEnd"/>
+      <w:r>
+        <w:t>(int) simplifies counting operations, such as word frequency in a text.</w:t>
+      </w:r>
+    </w:p>
+    <w:p>
+      <w:pPr>
+        <w:pStyle w:val="NoSpacing"/>
+      </w:pPr>
+      <w:r>
+        <w:t>sentence = "apple banana apple orange banana apple"</w:t>
+      </w:r>
+    </w:p>
+    <w:p>
+      <w:pPr>
+        <w:pStyle w:val="NoSpacing"/>
+      </w:pPr>
+      <w:proofErr w:type="spellStart"/>
+      <w:r>
+        <w:t>word_count</w:t>
+      </w:r>
+      <w:proofErr w:type="spellEnd"/>
+      <w:r>
+        <w:t xml:space="preserve"> = </w:t>
+      </w:r>
+      <w:proofErr w:type="spellStart"/>
+      <w:r>
+        <w:t>defaultdict</w:t>
+      </w:r>
+      <w:proofErr w:type="spellEnd"/>
+      <w:r>
+        <w:t>(int)</w:t>
+      </w:r>
+    </w:p>
+    <w:p>
+      <w:pPr>
+        <w:pStyle w:val="NoSpacing"/>
+      </w:pPr>
+    </w:p>
+    <w:p>
+      <w:pPr>
+        <w:pStyle w:val="NoSpacing"/>
+      </w:pPr>
+      <w:r>
+        <w:t xml:space="preserve">for word in </w:t>
+      </w:r>
+      <w:proofErr w:type="spellStart"/>
+      <w:proofErr w:type="gramStart"/>
+      <w:r>
+        <w:t>sentence.split</w:t>
+      </w:r>
+      <w:proofErr w:type="spellEnd"/>
+      <w:proofErr w:type="gramEnd"/>
+      <w:r>
+        <w:t>():</w:t>
+      </w:r>
+    </w:p>
+    <w:p>
+      <w:pPr>
+        <w:pStyle w:val="NoSpacing"/>
+      </w:pPr>
+      <w:r>
+        <w:t xml:space="preserve">    </w:t>
+      </w:r>
+      <w:proofErr w:type="spellStart"/>
+      <w:r>
+        <w:t>word_count</w:t>
+      </w:r>
+      <w:proofErr w:type="spellEnd"/>
+      <w:r>
+        <w:t xml:space="preserve">[word] += 1  </w:t>
+      </w:r>
+    </w:p>
+    <w:p>
+      <w:pPr>
+        <w:pStyle w:val="NoSpacing"/>
+      </w:pPr>
+    </w:p>
+    <w:p>
+      <w:pPr>
+        <w:pStyle w:val="NoSpacing"/>
+      </w:pPr>
+      <w:r>
+        <w:t>print(</w:t>
+      </w:r>
+      <w:proofErr w:type="spellStart"/>
+      <w:r>
+        <w:t>word_count</w:t>
+      </w:r>
+      <w:proofErr w:type="spellEnd"/>
+      <w:r>
+        <w:t xml:space="preserve">)  </w:t>
+      </w:r>
+    </w:p>
+    <w:p>
+      <w:pPr>
+        <w:pStyle w:val="NoSpacing"/>
+      </w:pPr>
+      <w:r>
+        <w:t># Output: {'apple': 3, 'banana': 2, 'orange': 1}</w:t>
+      </w:r>
+    </w:p>
+    <w:p>
+      <w:pPr>
+        <w:pStyle w:val="NoSpacing"/>
+      </w:pPr>
+      <w:r>
+        <w:t>Instead of manually checking if a word exists before incrementing, </w:t>
+      </w:r>
+      <w:proofErr w:type="spellStart"/>
+      <w:r>
+        <w:t>defaultdict</w:t>
+      </w:r>
+      <w:proofErr w:type="spellEnd"/>
+      <w:r>
+        <w:t>(int) initializes the count to 0 automatically.</w:t>
+      </w:r>
+    </w:p>
+    <w:p>
+      <w:pPr>
+        <w:pStyle w:val="NoSpacing"/>
+      </w:pPr>
+    </w:p>
+    <w:p>
+      <w:pPr>
+        <w:pStyle w:val="NoSpacing"/>
+      </w:pPr>
+      <w:r>
+        <w:rPr>
+          <w:b/>
+          <w:bCs/>
+        </w:rPr>
+        <w:t xml:space="preserve">3. </w:t>
+      </w:r>
+      <w:r>
+        <w:rPr>
+          <w:b/>
+          <w:bCs/>
+          <w:highlight w:val="green"/>
+        </w:rPr>
+        <w:t>Storing Unique Values with set</w:t>
+      </w:r>
+      <w:r>
+        <w:br/>
+        <w:t>If you need to maintain unique values per key, </w:t>
+      </w:r>
+      <w:proofErr w:type="spellStart"/>
+      <w:r>
+        <w:t>defaultdict</w:t>
+      </w:r>
+      <w:proofErr w:type="spellEnd"/>
+      <w:r>
+        <w:t>(set) is a great choice.</w:t>
+      </w:r>
+    </w:p>
+    <w:p>
+      <w:pPr>
+        <w:pStyle w:val="NoSpacing"/>
+      </w:pPr>
+      <w:proofErr w:type="spellStart"/>
+      <w:r>
+        <w:t>user_hobbies</w:t>
+      </w:r>
+      <w:proofErr w:type="spellEnd"/>
+      <w:r>
+        <w:t xml:space="preserve"> = </w:t>
+      </w:r>
+      <w:proofErr w:type="spellStart"/>
+      <w:r>
+        <w:t>defaultdict</w:t>
+      </w:r>
+      <w:proofErr w:type="spellEnd"/>
+      <w:r>
+        <w:t>(set)</w:t>
+      </w:r>
+    </w:p>
+    <w:p>
+      <w:pPr>
+        <w:pStyle w:val="NoSpacing"/>
+      </w:pPr>
+    </w:p>
+    <w:p>
+      <w:pPr>
+        <w:pStyle w:val="NoSpacing"/>
+      </w:pPr>
+      <w:proofErr w:type="spellStart"/>
+      <w:r>
+        <w:t>user_hobbies</w:t>
+      </w:r>
+      <w:proofErr w:type="spellEnd"/>
+      <w:r>
+        <w:t>['Alice'</w:t>
+      </w:r>
+      <w:proofErr w:type="gramStart"/>
+      <w:r>
+        <w:t>].add</w:t>
+      </w:r>
+      <w:proofErr w:type="gramEnd"/>
+      <w:r>
+        <w:t>('Reading')</w:t>
+      </w:r>
+    </w:p>
+    <w:p>
+      <w:pPr>
+        <w:pStyle w:val="NoSpacing"/>
+      </w:pPr>
+      <w:proofErr w:type="spellStart"/>
+      <w:r>
+        <w:t>user_hobbies</w:t>
+      </w:r>
+      <w:proofErr w:type="spellEnd"/>
+      <w:r>
+        <w:t>['Alice'</w:t>
+      </w:r>
+      <w:proofErr w:type="gramStart"/>
+      <w:r>
+        <w:t>].add</w:t>
+      </w:r>
+      <w:proofErr w:type="gramEnd"/>
+      <w:r>
+        <w:t>('Cycling')</w:t>
+      </w:r>
+    </w:p>
+    <w:p>
+      <w:pPr>
+        <w:pStyle w:val="NoSpacing"/>
+      </w:pPr>
+      <w:proofErr w:type="spellStart"/>
+      <w:r>
+        <w:t>user_hobbies</w:t>
+      </w:r>
+      <w:proofErr w:type="spellEnd"/>
+      <w:r>
+        <w:t>['Bob'</w:t>
+      </w:r>
+      <w:proofErr w:type="gramStart"/>
+      <w:r>
+        <w:t>].add</w:t>
+      </w:r>
+      <w:proofErr w:type="gramEnd"/>
+      <w:r>
+        <w:t>('Swimming')</w:t>
+      </w:r>
+    </w:p>
+    <w:p>
+      <w:pPr>
+        <w:pStyle w:val="NoSpacing"/>
+      </w:pPr>
+    </w:p>
+    <w:p>
+      <w:pPr>
+        <w:pStyle w:val="NoSpacing"/>
+      </w:pPr>
+      <w:r>
+        <w:t>print(</w:t>
+      </w:r>
+      <w:proofErr w:type="spellStart"/>
+      <w:r>
+        <w:t>user_hobbies</w:t>
+      </w:r>
+      <w:proofErr w:type="spellEnd"/>
+      <w:r>
+        <w:t xml:space="preserve">)  </w:t>
+      </w:r>
+    </w:p>
+    <w:p>
+      <w:pPr>
+        <w:pStyle w:val="NoSpacing"/>
+      </w:pPr>
+      <w:r>
+        <w:t># Output: {'Alice': {'Reading', 'Cycling'}, 'Bob': {'Swimming'}}</w:t>
+      </w:r>
+    </w:p>
+    <w:p>
+      <w:pPr>
+        <w:pStyle w:val="NoSpacing"/>
+      </w:pPr>
+      <w:r>
+        <w:t>This approach ensures no duplicate hobbies are stored under the same user.</w:t>
+      </w:r>
+    </w:p>
+    <w:p>
+      <w:pPr>
+        <w:pStyle w:val="NoSpacing"/>
+      </w:pPr>
+    </w:p>
+    <w:p>
+      <w:pPr>
+        <w:pStyle w:val="NoSpacing"/>
+      </w:pPr>
+    </w:p>
+    <w:p>
+      <w:pPr>
+        <w:pStyle w:val="NoSpacing"/>
+        <w:rPr>
+          <w:b/>
+          <w:bCs/>
+        </w:rPr>
+      </w:pPr>
+      <w:r>
+        <w:rPr>
+          <w:b/>
+          <w:bCs/>
+        </w:rPr>
+        <w:t>Counter Dictionary Usage</w:t>
+      </w:r>
+    </w:p>
+    <w:p>
+      <w:pPr>
+        <w:pStyle w:val="NoSpacing"/>
+      </w:pPr>
+      <w:r>
+        <w:t>In this lesson, we will explore </w:t>
+      </w:r>
+      <w:r>
+        <w:rPr>
+          <w:b/>
+          <w:bCs/>
+        </w:rPr>
+        <w:t>Counter dictionaries</w:t>
+      </w:r>
+      <w:r>
+        <w:t>, a specialized type of dictionary from the </w:t>
+      </w:r>
+      <w:proofErr w:type="gramStart"/>
+      <w:r>
+        <w:t>collections</w:t>
+      </w:r>
+      <w:proofErr w:type="gramEnd"/>
+      <w:r>
+        <w:t> module. The </w:t>
+      </w:r>
+      <w:r>
+        <w:rPr>
+          <w:b/>
+          <w:bCs/>
+        </w:rPr>
+        <w:t>Counter</w:t>
+      </w:r>
+      <w:r>
+        <w:t> class is designed to count occurrences of elements in a collection, such as a list or a string. It simplifies counting tasks and provides useful functionality for handling frequency-based operations.</w:t>
+      </w:r>
+    </w:p>
+    <w:p>
+      <w:pPr>
+        <w:pStyle w:val="NoSpacing"/>
+      </w:pPr>
+      <w:r>
+        <w:pict w14:anchorId="5B409F7F">
+          <v:rect id="_x0000_i1119" style="width:566.05pt;height:1.5pt" o:hrpct="0" o:hrstd="t" o:hr="t" fillcolor="#a0a0a0" stroked="f"/>
+        </w:pict>
+      </w:r>
+    </w:p>
+    <w:p>
+      <w:pPr>
+        <w:pStyle w:val="NoSpacing"/>
+      </w:pPr>
+      <w:r>
+        <w:t>Python’s Counter makes counting elements much easier. To use it, first, import the </w:t>
+      </w:r>
+      <w:r>
+        <w:rPr>
+          <w:b/>
+          <w:bCs/>
+        </w:rPr>
+        <w:t>Counter</w:t>
+      </w:r>
+      <w:r>
+        <w:t> class from the </w:t>
+      </w:r>
+      <w:proofErr w:type="gramStart"/>
+      <w:r>
+        <w:t>collections</w:t>
+      </w:r>
+      <w:proofErr w:type="gramEnd"/>
+      <w:r>
+        <w:t> module:</w:t>
+      </w:r>
+    </w:p>
+    <w:p>
+      <w:pPr>
+        <w:pStyle w:val="NoSpacing"/>
+      </w:pPr>
+      <w:r>
+        <w:t>from collections import Counter</w:t>
+      </w:r>
+    </w:p>
+    <w:p>
+      <w:pPr>
+        <w:pStyle w:val="NoSpacing"/>
+      </w:pPr>
+      <w:r>
+        <w:t>fruits = ['apple', 'banana', 'apple', 'orange', 'banana', 'banana']</w:t>
+      </w:r>
+    </w:p>
+    <w:p>
+      <w:pPr>
+        <w:pStyle w:val="NoSpacing"/>
+      </w:pPr>
+      <w:proofErr w:type="spellStart"/>
+      <w:r>
+        <w:t>fruit_counter</w:t>
+      </w:r>
+      <w:proofErr w:type="spellEnd"/>
+      <w:r>
+        <w:t xml:space="preserve"> = Counter(fruits)</w:t>
+      </w:r>
+    </w:p>
+    <w:p>
+      <w:pPr>
+        <w:pStyle w:val="NoSpacing"/>
+      </w:pPr>
+      <w:r>
+        <w:t>print(</w:t>
+      </w:r>
+      <w:proofErr w:type="spellStart"/>
+      <w:r>
+        <w:t>fruit_</w:t>
+      </w:r>
+      <w:proofErr w:type="gramStart"/>
+      <w:r>
+        <w:t>counter</w:t>
+      </w:r>
+      <w:proofErr w:type="spellEnd"/>
+      <w:r>
+        <w:t>)  #</w:t>
+      </w:r>
+      <w:proofErr w:type="gramEnd"/>
+      <w:r>
+        <w:t xml:space="preserve"> Output -&gt; </w:t>
+      </w:r>
+      <w:proofErr w:type="gramStart"/>
+      <w:r>
+        <w:t>Counter(</w:t>
+      </w:r>
+      <w:proofErr w:type="gramEnd"/>
+      <w:r>
+        <w:t>{'banana': 3, 'apple': 2, 'orange': 1})</w:t>
+      </w:r>
+    </w:p>
+    <w:p>
+      <w:pPr>
+        <w:pStyle w:val="NoSpacing"/>
+      </w:pPr>
+      <w:r>
+        <w:t>The output indicates that the word "banana" appears three times, "apple" appears twice, and "orange" appears once.</w:t>
+      </w:r>
+    </w:p>
+    <w:p>
+      <w:pPr>
+        <w:pStyle w:val="NoSpacing"/>
+      </w:pPr>
+      <w:r>
+        <w:pict w14:anchorId="5933BE00">
+          <v:rect id="_x0000_i1120" style="width:566.05pt;height:1.5pt" o:hrpct="0" o:hrstd="t" o:hr="t" fillcolor="#a0a0a0" stroked="f"/>
+        </w:pict>
+      </w:r>
+    </w:p>
+    <w:p>
+      <w:pPr>
+        <w:pStyle w:val="NoSpacing"/>
+      </w:pPr>
+      <w:r>
+        <w:rPr>
+          <w:b/>
+          <w:bCs/>
+        </w:rPr>
+        <w:lastRenderedPageBreak/>
+        <w:t>Using Counter with Strings</w:t>
+      </w:r>
+      <w:r>
+        <w:br/>
+        <w:t>You can also use Counter to count character occurrences in a string:</w:t>
+      </w:r>
+    </w:p>
+    <w:p>
+      <w:pPr>
+        <w:pStyle w:val="NoSpacing"/>
+      </w:pPr>
+      <w:r>
+        <w:t>word = "hello world"</w:t>
+      </w:r>
+    </w:p>
+    <w:p>
+      <w:pPr>
+        <w:pStyle w:val="NoSpacing"/>
+      </w:pPr>
+      <w:proofErr w:type="spellStart"/>
+      <w:r>
+        <w:t>char_counter</w:t>
+      </w:r>
+      <w:proofErr w:type="spellEnd"/>
+      <w:r>
+        <w:t xml:space="preserve"> = Counter(word)</w:t>
+      </w:r>
+    </w:p>
+    <w:p>
+      <w:pPr>
+        <w:pStyle w:val="NoSpacing"/>
+      </w:pPr>
+      <w:r>
+        <w:t>print(</w:t>
+      </w:r>
+      <w:proofErr w:type="spellStart"/>
+      <w:r>
+        <w:t>char_counter</w:t>
+      </w:r>
+      <w:proofErr w:type="spellEnd"/>
+      <w:r>
+        <w:t>)</w:t>
+      </w:r>
+    </w:p>
+    <w:p>
+      <w:pPr>
+        <w:pStyle w:val="NoSpacing"/>
+      </w:pPr>
+      <w:r>
+        <w:rPr>
+          <w:b/>
+          <w:bCs/>
+        </w:rPr>
+        <w:t>Output:</w:t>
+      </w:r>
+    </w:p>
+    <w:p>
+      <w:pPr>
+        <w:pStyle w:val="NoSpacing"/>
+      </w:pPr>
+      <w:proofErr w:type="gramStart"/>
+      <w:r>
+        <w:t>Counter(</w:t>
+      </w:r>
+      <w:proofErr w:type="gramEnd"/>
+      <w:r>
+        <w:t>{'l': 3, 'o': 2, 'h': 1, 'e': 1, ' ': 1, 'w': 1, 'r': 1, 'd': 1})</w:t>
+      </w:r>
+    </w:p>
+    <w:p>
+      <w:pPr>
+        <w:pStyle w:val="NoSpacing"/>
+      </w:pPr>
+      <w:r>
+        <w:t>Here, 'l' appears </w:t>
+      </w:r>
+      <w:r>
+        <w:rPr>
+          <w:b/>
+          <w:bCs/>
+        </w:rPr>
+        <w:t>3 times</w:t>
+      </w:r>
+      <w:r>
+        <w:t>, 'o' appears </w:t>
+      </w:r>
+      <w:r>
+        <w:rPr>
+          <w:b/>
+          <w:bCs/>
+        </w:rPr>
+        <w:t>2 times</w:t>
+      </w:r>
+      <w:r>
+        <w:t>, and each of the other characters appears once.</w:t>
+      </w:r>
+    </w:p>
+    <w:p>
+      <w:pPr>
+        <w:pStyle w:val="NoSpacing"/>
+      </w:pPr>
+      <w:r>
+        <w:pict w14:anchorId="310CF14C">
+          <v:rect id="_x0000_i1121" style="width:566.05pt;height:1.5pt" o:hrpct="0" o:hrstd="t" o:hr="t" fillcolor="#a0a0a0" stroked="f"/>
+        </w:pict>
+      </w:r>
+    </w:p>
+    <w:p>
+      <w:pPr>
+        <w:pStyle w:val="NoSpacing"/>
+      </w:pPr>
+      <w:r>
+        <w:rPr>
+          <w:b/>
+          <w:bCs/>
+        </w:rPr>
+        <w:t xml:space="preserve">Finding the Most Common Elements </w:t>
+      </w:r>
+      <w:proofErr w:type="gramStart"/>
+      <w:r>
+        <w:rPr>
+          <w:b/>
+          <w:bCs/>
+        </w:rPr>
+        <w:t>(.</w:t>
+      </w:r>
+      <w:proofErr w:type="spellStart"/>
+      <w:r>
+        <w:rPr>
+          <w:b/>
+          <w:bCs/>
+        </w:rPr>
+        <w:t>most</w:t>
+      </w:r>
+      <w:proofErr w:type="gramEnd"/>
+      <w:r>
+        <w:rPr>
+          <w:b/>
+          <w:bCs/>
+        </w:rPr>
+        <w:t>_common</w:t>
+      </w:r>
+      <w:proofErr w:type="spellEnd"/>
+      <w:r>
+        <w:rPr>
+          <w:b/>
+          <w:bCs/>
+        </w:rPr>
+        <w:t>(n))</w:t>
+      </w:r>
+      <w:r>
+        <w:br/>
+        <w:t xml:space="preserve">Counter provides a useful </w:t>
+      </w:r>
+      <w:proofErr w:type="gramStart"/>
+      <w:r>
+        <w:t>method .</w:t>
+      </w:r>
+      <w:proofErr w:type="spellStart"/>
+      <w:r>
+        <w:t>most</w:t>
+      </w:r>
+      <w:proofErr w:type="gramEnd"/>
+      <w:r>
+        <w:t>_common</w:t>
+      </w:r>
+      <w:proofErr w:type="spellEnd"/>
+      <w:r>
+        <w:t>(n), which returns the top </w:t>
+      </w:r>
+      <w:r>
+        <w:rPr>
+          <w:b/>
+          <w:bCs/>
+        </w:rPr>
+        <w:t>n</w:t>
+      </w:r>
+      <w:r>
+        <w:t> most frequent elements:</w:t>
+      </w:r>
+    </w:p>
+    <w:p>
+      <w:pPr>
+        <w:pStyle w:val="NoSpacing"/>
+      </w:pPr>
+      <w:r>
+        <w:t>print(</w:t>
+      </w:r>
+      <w:proofErr w:type="spellStart"/>
+      <w:r>
+        <w:t>fruit_</w:t>
+      </w:r>
+      <w:proofErr w:type="gramStart"/>
+      <w:r>
+        <w:t>counter.most</w:t>
+      </w:r>
+      <w:proofErr w:type="gramEnd"/>
+      <w:r>
+        <w:t>_</w:t>
+      </w:r>
+      <w:proofErr w:type="gramStart"/>
+      <w:r>
+        <w:t>common</w:t>
+      </w:r>
+      <w:proofErr w:type="spellEnd"/>
+      <w:r>
+        <w:t>(</w:t>
+      </w:r>
+      <w:proofErr w:type="gramEnd"/>
+      <w:r>
+        <w:t>2</w:t>
+      </w:r>
+      <w:proofErr w:type="gramStart"/>
+      <w:r>
+        <w:t>))  #</w:t>
+      </w:r>
+      <w:proofErr w:type="gramEnd"/>
+      <w:r>
+        <w:t xml:space="preserve"> Get top 2 most common fruits</w:t>
+      </w:r>
+    </w:p>
+    <w:p>
+      <w:pPr>
+        <w:pStyle w:val="NoSpacing"/>
+      </w:pPr>
+      <w:r>
+        <w:rPr>
+          <w:b/>
+          <w:bCs/>
+        </w:rPr>
+        <w:t>Output:</w:t>
+      </w:r>
+    </w:p>
+    <w:p>
+      <w:pPr>
+        <w:pStyle w:val="NoSpacing"/>
+      </w:pPr>
+      <w:r>
+        <w:t>[('banana', 3), ('apple', 2)]</w:t>
+      </w:r>
+    </w:p>
+    <w:p>
+      <w:pPr>
+        <w:pStyle w:val="NoSpacing"/>
+      </w:pPr>
+      <w:r>
+        <w:t>This shows 'banana' is the most common, followed by 'apple'.</w:t>
       </w:r>
     </w:p>
     <w:p>

</xml_diff>